<commit_message>
Update Terminkarten: add QR code, website and email address
</commit_message>
<xml_diff>
--- a/Terminkarten.docx
+++ b/Terminkarten.docx
@@ -40,54 +40,145 @@
             </w:tcMar>
             <w:vAlign w:val="top"/>
           </w:tcPr>
-          <w:p>
-            <w:pPr>
-              <w:spacing w:after="85" w:before="0"/>
-            </w:pPr>
-            <w:r>
-              <w:drawing>
-                <wp:inline distT="0" distB="0" distL="0" distR="0">
-                  <wp:extent cx="15087600000" cy="10058400000"/>
-                  <wp:effectExtent t="0" r="0" b="0" l="0"/>
-                  <wp:docPr id="1" name="" descr="" title=""/>
-                  <wp:cNvGraphicFramePr>
-                    <a:graphicFrameLocks xmlns:a="http://schemas.openxmlformats.org/drawingml/2006/main" noChangeAspect="1"/>
-                  </wp:cNvGraphicFramePr>
-                  <a:graphic xmlns:a="http://schemas.openxmlformats.org/drawingml/2006/main">
-                    <a:graphicData uri="http://schemas.openxmlformats.org/drawingml/2006/picture">
-                      <pic:pic xmlns:pic="http://schemas.openxmlformats.org/drawingml/2006/picture">
-                        <pic:nvPicPr>
-                          <pic:cNvPr id="0" name="" descr=""/>
-                          <pic:cNvPicPr>
-                            <a:picLocks noChangeAspect="1" noChangeArrowheads="1"/>
-                          </pic:cNvPicPr>
-                        </pic:nvPicPr>
-                        <pic:blipFill>
-                          <a:blip r:embed="rId7" cstate="none"/>
-                          <a:srcRect/>
-                          <a:stretch>
-                            <a:fillRect/>
-                          </a:stretch>
-                        </pic:blipFill>
-                        <pic:spPr bwMode="auto">
-                          <a:xfrm>
-                            <a:off x="0" y="0"/>
-                            <a:ext cx="15087600000" cy="10058400000"/>
-                          </a:xfrm>
-                          <a:prstGeom prst="rect">
-                            <a:avLst/>
-                          </a:prstGeom>
-                        </pic:spPr>
-                      </pic:pic>
-                    </a:graphicData>
-                  </a:graphic>
-                </wp:inline>
-              </w:drawing>
-            </w:r>
-          </w:p>
-          <w:p>
-            <w:pPr>
-              <w:spacing w:after="113" w:before="0"/>
+          <w:tbl>
+            <w:tblPr>
+              <w:tblW w:type="dxa" w:w="4423"/>
+              <w:tblBorders>
+                <w:top w:val="none" w:color="FFFFFF" w:sz="0"/>
+                <w:left w:val="none" w:color="FFFFFF" w:sz="0"/>
+                <w:bottom w:val="none" w:color="FFFFFF" w:sz="0"/>
+                <w:right w:val="none" w:color="FFFFFF" w:sz="0"/>
+                <w:insideH w:val="single" w:color="auto" w:sz="4"/>
+                <w:insideV w:val="single" w:color="auto" w:sz="4"/>
+              </w:tblBorders>
+            </w:tblPr>
+            <w:tblGrid>
+              <w:gridCol w:w="2156"/>
+              <w:gridCol w:w="2154"/>
+            </w:tblGrid>
+            <w:tr>
+              <w:tc>
+                <w:tcPr>
+                  <w:tcW w:type="dxa" w:w="2156"/>
+                  <w:tcBorders>
+                    <w:top w:val="none" w:color="FFFFFF" w:sz="0"/>
+                    <w:left w:val="none" w:color="FFFFFF" w:sz="0"/>
+                    <w:bottom w:val="none" w:color="FFFFFF" w:sz="0"/>
+                    <w:right w:val="none" w:color="FFFFFF" w:sz="0"/>
+                  </w:tcBorders>
+                  <w:tcMar>
+                    <w:top w:type="dxa" w:w="0"/>
+                    <w:left w:type="dxa" w:w="0"/>
+                    <w:bottom w:type="dxa" w:w="0"/>
+                    <w:right w:type="dxa" w:w="0"/>
+                  </w:tcMar>
+                  <w:vAlign w:val="center"/>
+                </w:tcPr>
+                <w:p>
+                  <w:pPr>
+                    <w:spacing w:after="0" w:before="0"/>
+                  </w:pPr>
+                  <w:r>
+                    <w:drawing>
+                      <wp:inline distT="0" distB="0" distL="0" distR="0">
+                        <wp:extent cx="15087600000" cy="10058400000"/>
+                        <wp:effectExtent t="0" r="0" b="0" l="0"/>
+                        <wp:docPr id="1" name="" descr="" title=""/>
+                        <wp:cNvGraphicFramePr>
+                          <a:graphicFrameLocks xmlns:a="http://schemas.openxmlformats.org/drawingml/2006/main" noChangeAspect="1"/>
+                        </wp:cNvGraphicFramePr>
+                        <a:graphic xmlns:a="http://schemas.openxmlformats.org/drawingml/2006/main">
+                          <a:graphicData uri="http://schemas.openxmlformats.org/drawingml/2006/picture">
+                            <pic:pic xmlns:pic="http://schemas.openxmlformats.org/drawingml/2006/picture">
+                              <pic:nvPicPr>
+                                <pic:cNvPr id="0" name="" descr=""/>
+                                <pic:cNvPicPr>
+                                  <a:picLocks noChangeAspect="1" noChangeArrowheads="1"/>
+                                </pic:cNvPicPr>
+                              </pic:nvPicPr>
+                              <pic:blipFill>
+                                <a:blip r:embed="rId7" cstate="none"/>
+                                <a:srcRect/>
+                                <a:stretch>
+                                  <a:fillRect/>
+                                </a:stretch>
+                              </pic:blipFill>
+                              <pic:spPr bwMode="auto">
+                                <a:xfrm>
+                                  <a:off x="0" y="0"/>
+                                  <a:ext cx="15087600000" cy="10058400000"/>
+                                </a:xfrm>
+                                <a:prstGeom prst="rect">
+                                  <a:avLst/>
+                                </a:prstGeom>
+                              </pic:spPr>
+                            </pic:pic>
+                          </a:graphicData>
+                        </a:graphic>
+                      </wp:inline>
+                    </w:drawing>
+                  </w:r>
+                </w:p>
+              </w:tc>
+              <w:tc>
+                <w:tcPr>
+                  <w:tcW w:type="dxa" w:w="2154"/>
+                  <w:tcBorders>
+                    <w:top w:val="none" w:color="FFFFFF" w:sz="0"/>
+                    <w:left w:val="none" w:color="FFFFFF" w:sz="0"/>
+                    <w:bottom w:val="none" w:color="FFFFFF" w:sz="0"/>
+                    <w:right w:val="none" w:color="FFFFFF" w:sz="0"/>
+                  </w:tcBorders>
+                  <w:tcMar>
+                    <w:top w:type="dxa" w:w="0"/>
+                    <w:left w:type="dxa" w:w="113"/>
+                    <w:bottom w:type="dxa" w:w="0"/>
+                    <w:right w:type="dxa" w:w="0"/>
+                  </w:tcMar>
+                  <w:vAlign w:val="center"/>
+                </w:tcPr>
+                <w:p>
+                  <w:pPr>
+                    <w:spacing w:after="45" w:before="0"/>
+                    <w:jc w:val="right"/>
+                  </w:pPr>
+                  <w:r>
+                    <w:rPr>
+                      <w:color w:val="1A6374"/>
+                      <w:sz w:val="11"/>
+                      <w:szCs w:val="11"/>
+                    </w:rPr>
+                    <w:t xml:space="preserve">naturheilpraxis-hilfreich.de</w:t>
+                  </w:r>
+                </w:p>
+                <w:p>
+                  <w:pPr>
+                    <w:spacing w:after="0" w:before="0"/>
+                    <w:jc w:val="right"/>
+                  </w:pPr>
+                  <w:r>
+                    <w:rPr>
+                      <w:color w:val="1A6374"/>
+                      <w:sz w:val="11"/>
+                      <w:szCs w:val="11"/>
+                    </w:rPr>
+                    <w:t xml:space="preserve">info@naturheilpraxis-hilfreich.de</w:t>
+                  </w:r>
+                </w:p>
+              </w:tc>
+            </w:tr>
+          </w:tbl>
+          <w:p>
+            <w:pPr>
+              <w:pBdr>
+                <w:bottom w:val="single" w:color="DDD5C8" w:sz="2" w:space="1"/>
+              </w:pBdr>
+              <w:spacing w:after="0" w:before="85"/>
+            </w:pPr>
+          </w:p>
+          <w:p>
+            <w:pPr>
+              <w:spacing w:after="113" w:before="113"/>
             </w:pPr>
             <w:r>
               <w:rPr>
@@ -142,7 +233,7 @@
           <w:p>
             <w:pPr>
               <w:pBdr>
-                <w:bottom w:val="single" w:color="B08850" w:sz="3" w:space="3"/>
+                <w:bottom w:val="single" w:color="B08850" w:sz="3" w:space="2"/>
               </w:pBdr>
               <w:spacing w:after="85" w:before="0"/>
             </w:pPr>
@@ -157,19 +248,126 @@
               <w:t xml:space="preserve">Bei Verhinderung bitten wir um frühzeitige Absage.</w:t>
             </w:r>
           </w:p>
-          <w:p>
-            <w:pPr>
-              <w:spacing w:after="0" w:before="85"/>
-            </w:pPr>
-            <w:r>
-              <w:rPr>
-                <w:color w:val="7E7568"/>
-                <w:sz w:val="13"/>
-                <w:szCs w:val="13"/>
-              </w:rPr>
-              <w:t xml:space="preserve">Homberger Straße 348  ·  0176 22923179</w:t>
-            </w:r>
-          </w:p>
+          <w:tbl>
+            <w:tblPr>
+              <w:tblW w:type="dxa" w:w="4423"/>
+              <w:tblBorders>
+                <w:top w:val="none" w:color="FFFFFF" w:sz="0"/>
+                <w:left w:val="none" w:color="FFFFFF" w:sz="0"/>
+                <w:bottom w:val="none" w:color="FFFFFF" w:sz="0"/>
+                <w:right w:val="none" w:color="FFFFFF" w:sz="0"/>
+                <w:insideH w:val="single" w:color="auto" w:sz="4"/>
+                <w:insideV w:val="single" w:color="auto" w:sz="4"/>
+              </w:tblBorders>
+              <w:tblCellMar>
+                <w:top w:type="dxa" w:w="85"/>
+                <w:left w:type="dxa" w:w="0"/>
+                <w:bottom w:type="dxa" w:w="0"/>
+                <w:right w:type="dxa" w:w="0"/>
+              </w:tblCellMar>
+            </w:tblPr>
+            <w:tblGrid>
+              <w:gridCol w:w="3686"/>
+              <w:gridCol w:w="737"/>
+            </w:tblGrid>
+            <w:tr>
+              <w:tc>
+                <w:tcPr>
+                  <w:tcW w:type="dxa" w:w="3686"/>
+                  <w:tcBorders>
+                    <w:top w:val="none" w:color="FFFFFF" w:sz="0"/>
+                    <w:left w:val="none" w:color="FFFFFF" w:sz="0"/>
+                    <w:bottom w:val="none" w:color="FFFFFF" w:sz="0"/>
+                    <w:right w:val="none" w:color="FFFFFF" w:sz="0"/>
+                  </w:tcBorders>
+                  <w:tcMar>
+                    <w:top w:type="dxa" w:w="0"/>
+                    <w:left w:type="dxa" w:w="0"/>
+                    <w:bottom w:type="dxa" w:w="0"/>
+                    <w:right w:type="dxa" w:w="0"/>
+                  </w:tcMar>
+                  <w:vAlign w:val="center"/>
+                </w:tcPr>
+                <w:p>
+                  <w:pPr>
+                    <w:spacing w:after="0" w:before="0"/>
+                  </w:pPr>
+                  <w:r>
+                    <w:rPr>
+                      <w:color w:val="7E7568"/>
+                      <w:sz w:val="13"/>
+                      <w:szCs w:val="13"/>
+                    </w:rPr>
+                    <w:t xml:space="preserve">Homberger Straße 348  ·  0176 22923179</w:t>
+                  </w:r>
+                </w:p>
+              </w:tc>
+              <w:tc>
+                <w:tcPr>
+                  <w:tcW w:type="dxa" w:w="737"/>
+                  <w:tcBorders>
+                    <w:top w:val="none" w:color="FFFFFF" w:sz="0"/>
+                    <w:left w:val="none" w:color="FFFFFF" w:sz="0"/>
+                    <w:bottom w:val="none" w:color="FFFFFF" w:sz="0"/>
+                    <w:right w:val="none" w:color="FFFFFF" w:sz="0"/>
+                  </w:tcBorders>
+                  <w:tcMar>
+                    <w:top w:type="dxa" w:w="0"/>
+                    <w:left w:type="dxa" w:w="57"/>
+                    <w:bottom w:type="dxa" w:w="0"/>
+                    <w:right w:type="dxa" w:w="0"/>
+                  </w:tcMar>
+                  <w:vAlign w:val="center"/>
+                </w:tcPr>
+                <w:p>
+                  <w:pPr>
+                    <w:spacing w:after="0" w:before="0"/>
+                  </w:pPr>
+                  <w:r>
+                    <w:drawing>
+                      <wp:inline distT="0" distB="0" distL="0" distR="0">
+                        <wp:extent cx="3771900000" cy="3771900000"/>
+                        <wp:effectExtent t="0" r="0" b="0" l="0"/>
+                        <wp:docPr id="1" name="" descr="" title=""/>
+                        <wp:cNvGraphicFramePr>
+                          <a:graphicFrameLocks xmlns:a="http://schemas.openxmlformats.org/drawingml/2006/main" noChangeAspect="1"/>
+                        </wp:cNvGraphicFramePr>
+                        <a:graphic xmlns:a="http://schemas.openxmlformats.org/drawingml/2006/main">
+                          <a:graphicData uri="http://schemas.openxmlformats.org/drawingml/2006/picture">
+                            <pic:pic xmlns:pic="http://schemas.openxmlformats.org/drawingml/2006/picture">
+                              <pic:nvPicPr>
+                                <pic:cNvPr id="0" name="" descr=""/>
+                                <pic:cNvPicPr>
+                                  <a:picLocks noChangeAspect="1" noChangeArrowheads="1"/>
+                                </pic:cNvPicPr>
+                              </pic:nvPicPr>
+                              <pic:blipFill>
+                                <a:blip r:embed="rId8" cstate="none"/>
+                                <a:srcRect/>
+                                <a:stretch>
+                                  <a:fillRect/>
+                                </a:stretch>
+                              </pic:blipFill>
+                              <pic:spPr bwMode="auto">
+                                <a:xfrm>
+                                  <a:off x="0" y="0"/>
+                                  <a:ext cx="3771900000" cy="3771900000"/>
+                                </a:xfrm>
+                                <a:prstGeom prst="rect">
+                                  <a:avLst/>
+                                </a:prstGeom>
+                              </pic:spPr>
+                            </pic:pic>
+                          </a:graphicData>
+                        </a:graphic>
+                      </wp:inline>
+                    </w:drawing>
+                  </w:r>
+                </w:p>
+              </w:tc>
+            </w:tr>
+          </w:tbl>
+          <w:p/>
         </w:tc>
         <w:tc>
           <w:tcPr>
@@ -200,54 +398,145 @@
             </w:tcMar>
             <w:vAlign w:val="top"/>
           </w:tcPr>
-          <w:p>
-            <w:pPr>
-              <w:spacing w:after="85" w:before="0"/>
-            </w:pPr>
-            <w:r>
-              <w:drawing>
-                <wp:inline distT="0" distB="0" distL="0" distR="0">
-                  <wp:extent cx="15087600000" cy="10058400000"/>
-                  <wp:effectExtent t="0" r="0" b="0" l="0"/>
-                  <wp:docPr id="1" name="" descr="" title=""/>
-                  <wp:cNvGraphicFramePr>
-                    <a:graphicFrameLocks xmlns:a="http://schemas.openxmlformats.org/drawingml/2006/main" noChangeAspect="1"/>
-                  </wp:cNvGraphicFramePr>
-                  <a:graphic xmlns:a="http://schemas.openxmlformats.org/drawingml/2006/main">
-                    <a:graphicData uri="http://schemas.openxmlformats.org/drawingml/2006/picture">
-                      <pic:pic xmlns:pic="http://schemas.openxmlformats.org/drawingml/2006/picture">
-                        <pic:nvPicPr>
-                          <pic:cNvPr id="0" name="" descr=""/>
-                          <pic:cNvPicPr>
-                            <a:picLocks noChangeAspect="1" noChangeArrowheads="1"/>
-                          </pic:cNvPicPr>
-                        </pic:nvPicPr>
-                        <pic:blipFill>
-                          <a:blip r:embed="rId7" cstate="none"/>
-                          <a:srcRect/>
-                          <a:stretch>
-                            <a:fillRect/>
-                          </a:stretch>
-                        </pic:blipFill>
-                        <pic:spPr bwMode="auto">
-                          <a:xfrm>
-                            <a:off x="0" y="0"/>
-                            <a:ext cx="15087600000" cy="10058400000"/>
-                          </a:xfrm>
-                          <a:prstGeom prst="rect">
-                            <a:avLst/>
-                          </a:prstGeom>
-                        </pic:spPr>
-                      </pic:pic>
-                    </a:graphicData>
-                  </a:graphic>
-                </wp:inline>
-              </w:drawing>
-            </w:r>
-          </w:p>
-          <w:p>
-            <w:pPr>
-              <w:spacing w:after="113" w:before="0"/>
+          <w:tbl>
+            <w:tblPr>
+              <w:tblW w:type="dxa" w:w="4423"/>
+              <w:tblBorders>
+                <w:top w:val="none" w:color="FFFFFF" w:sz="0"/>
+                <w:left w:val="none" w:color="FFFFFF" w:sz="0"/>
+                <w:bottom w:val="none" w:color="FFFFFF" w:sz="0"/>
+                <w:right w:val="none" w:color="FFFFFF" w:sz="0"/>
+                <w:insideH w:val="single" w:color="auto" w:sz="4"/>
+                <w:insideV w:val="single" w:color="auto" w:sz="4"/>
+              </w:tblBorders>
+            </w:tblPr>
+            <w:tblGrid>
+              <w:gridCol w:w="2156"/>
+              <w:gridCol w:w="2154"/>
+            </w:tblGrid>
+            <w:tr>
+              <w:tc>
+                <w:tcPr>
+                  <w:tcW w:type="dxa" w:w="2156"/>
+                  <w:tcBorders>
+                    <w:top w:val="none" w:color="FFFFFF" w:sz="0"/>
+                    <w:left w:val="none" w:color="FFFFFF" w:sz="0"/>
+                    <w:bottom w:val="none" w:color="FFFFFF" w:sz="0"/>
+                    <w:right w:val="none" w:color="FFFFFF" w:sz="0"/>
+                  </w:tcBorders>
+                  <w:tcMar>
+                    <w:top w:type="dxa" w:w="0"/>
+                    <w:left w:type="dxa" w:w="0"/>
+                    <w:bottom w:type="dxa" w:w="0"/>
+                    <w:right w:type="dxa" w:w="0"/>
+                  </w:tcMar>
+                  <w:vAlign w:val="center"/>
+                </w:tcPr>
+                <w:p>
+                  <w:pPr>
+                    <w:spacing w:after="0" w:before="0"/>
+                  </w:pPr>
+                  <w:r>
+                    <w:drawing>
+                      <wp:inline distT="0" distB="0" distL="0" distR="0">
+                        <wp:extent cx="15087600000" cy="10058400000"/>
+                        <wp:effectExtent t="0" r="0" b="0" l="0"/>
+                        <wp:docPr id="1" name="" descr="" title=""/>
+                        <wp:cNvGraphicFramePr>
+                          <a:graphicFrameLocks xmlns:a="http://schemas.openxmlformats.org/drawingml/2006/main" noChangeAspect="1"/>
+                        </wp:cNvGraphicFramePr>
+                        <a:graphic xmlns:a="http://schemas.openxmlformats.org/drawingml/2006/main">
+                          <a:graphicData uri="http://schemas.openxmlformats.org/drawingml/2006/picture">
+                            <pic:pic xmlns:pic="http://schemas.openxmlformats.org/drawingml/2006/picture">
+                              <pic:nvPicPr>
+                                <pic:cNvPr id="0" name="" descr=""/>
+                                <pic:cNvPicPr>
+                                  <a:picLocks noChangeAspect="1" noChangeArrowheads="1"/>
+                                </pic:cNvPicPr>
+                              </pic:nvPicPr>
+                              <pic:blipFill>
+                                <a:blip r:embed="rId7" cstate="none"/>
+                                <a:srcRect/>
+                                <a:stretch>
+                                  <a:fillRect/>
+                                </a:stretch>
+                              </pic:blipFill>
+                              <pic:spPr bwMode="auto">
+                                <a:xfrm>
+                                  <a:off x="0" y="0"/>
+                                  <a:ext cx="15087600000" cy="10058400000"/>
+                                </a:xfrm>
+                                <a:prstGeom prst="rect">
+                                  <a:avLst/>
+                                </a:prstGeom>
+                              </pic:spPr>
+                            </pic:pic>
+                          </a:graphicData>
+                        </a:graphic>
+                      </wp:inline>
+                    </w:drawing>
+                  </w:r>
+                </w:p>
+              </w:tc>
+              <w:tc>
+                <w:tcPr>
+                  <w:tcW w:type="dxa" w:w="2154"/>
+                  <w:tcBorders>
+                    <w:top w:val="none" w:color="FFFFFF" w:sz="0"/>
+                    <w:left w:val="none" w:color="FFFFFF" w:sz="0"/>
+                    <w:bottom w:val="none" w:color="FFFFFF" w:sz="0"/>
+                    <w:right w:val="none" w:color="FFFFFF" w:sz="0"/>
+                  </w:tcBorders>
+                  <w:tcMar>
+                    <w:top w:type="dxa" w:w="0"/>
+                    <w:left w:type="dxa" w:w="113"/>
+                    <w:bottom w:type="dxa" w:w="0"/>
+                    <w:right w:type="dxa" w:w="0"/>
+                  </w:tcMar>
+                  <w:vAlign w:val="center"/>
+                </w:tcPr>
+                <w:p>
+                  <w:pPr>
+                    <w:spacing w:after="45" w:before="0"/>
+                    <w:jc w:val="right"/>
+                  </w:pPr>
+                  <w:r>
+                    <w:rPr>
+                      <w:color w:val="1A6374"/>
+                      <w:sz w:val="11"/>
+                      <w:szCs w:val="11"/>
+                    </w:rPr>
+                    <w:t xml:space="preserve">naturheilpraxis-hilfreich.de</w:t>
+                  </w:r>
+                </w:p>
+                <w:p>
+                  <w:pPr>
+                    <w:spacing w:after="0" w:before="0"/>
+                    <w:jc w:val="right"/>
+                  </w:pPr>
+                  <w:r>
+                    <w:rPr>
+                      <w:color w:val="1A6374"/>
+                      <w:sz w:val="11"/>
+                      <w:szCs w:val="11"/>
+                    </w:rPr>
+                    <w:t xml:space="preserve">info@naturheilpraxis-hilfreich.de</w:t>
+                  </w:r>
+                </w:p>
+              </w:tc>
+            </w:tr>
+          </w:tbl>
+          <w:p>
+            <w:pPr>
+              <w:pBdr>
+                <w:bottom w:val="single" w:color="DDD5C8" w:sz="2" w:space="1"/>
+              </w:pBdr>
+              <w:spacing w:after="0" w:before="85"/>
+            </w:pPr>
+          </w:p>
+          <w:p>
+            <w:pPr>
+              <w:spacing w:after="113" w:before="113"/>
             </w:pPr>
             <w:r>
               <w:rPr>
@@ -302,7 +591,7 @@
           <w:p>
             <w:pPr>
               <w:pBdr>
-                <w:bottom w:val="single" w:color="B08850" w:sz="3" w:space="3"/>
+                <w:bottom w:val="single" w:color="B08850" w:sz="3" w:space="2"/>
               </w:pBdr>
               <w:spacing w:after="85" w:before="0"/>
             </w:pPr>
@@ -317,19 +606,126 @@
               <w:t xml:space="preserve">Bei Verhinderung bitten wir um frühzeitige Absage.</w:t>
             </w:r>
           </w:p>
-          <w:p>
-            <w:pPr>
-              <w:spacing w:after="0" w:before="85"/>
-            </w:pPr>
-            <w:r>
-              <w:rPr>
-                <w:color w:val="7E7568"/>
-                <w:sz w:val="13"/>
-                <w:szCs w:val="13"/>
-              </w:rPr>
-              <w:t xml:space="preserve">Homberger Straße 348  ·  0176 22923179</w:t>
-            </w:r>
-          </w:p>
+          <w:tbl>
+            <w:tblPr>
+              <w:tblW w:type="dxa" w:w="4423"/>
+              <w:tblBorders>
+                <w:top w:val="none" w:color="FFFFFF" w:sz="0"/>
+                <w:left w:val="none" w:color="FFFFFF" w:sz="0"/>
+                <w:bottom w:val="none" w:color="FFFFFF" w:sz="0"/>
+                <w:right w:val="none" w:color="FFFFFF" w:sz="0"/>
+                <w:insideH w:val="single" w:color="auto" w:sz="4"/>
+                <w:insideV w:val="single" w:color="auto" w:sz="4"/>
+              </w:tblBorders>
+              <w:tblCellMar>
+                <w:top w:type="dxa" w:w="85"/>
+                <w:left w:type="dxa" w:w="0"/>
+                <w:bottom w:type="dxa" w:w="0"/>
+                <w:right w:type="dxa" w:w="0"/>
+              </w:tblCellMar>
+            </w:tblPr>
+            <w:tblGrid>
+              <w:gridCol w:w="3686"/>
+              <w:gridCol w:w="737"/>
+            </w:tblGrid>
+            <w:tr>
+              <w:tc>
+                <w:tcPr>
+                  <w:tcW w:type="dxa" w:w="3686"/>
+                  <w:tcBorders>
+                    <w:top w:val="none" w:color="FFFFFF" w:sz="0"/>
+                    <w:left w:val="none" w:color="FFFFFF" w:sz="0"/>
+                    <w:bottom w:val="none" w:color="FFFFFF" w:sz="0"/>
+                    <w:right w:val="none" w:color="FFFFFF" w:sz="0"/>
+                  </w:tcBorders>
+                  <w:tcMar>
+                    <w:top w:type="dxa" w:w="0"/>
+                    <w:left w:type="dxa" w:w="0"/>
+                    <w:bottom w:type="dxa" w:w="0"/>
+                    <w:right w:type="dxa" w:w="0"/>
+                  </w:tcMar>
+                  <w:vAlign w:val="center"/>
+                </w:tcPr>
+                <w:p>
+                  <w:pPr>
+                    <w:spacing w:after="0" w:before="0"/>
+                  </w:pPr>
+                  <w:r>
+                    <w:rPr>
+                      <w:color w:val="7E7568"/>
+                      <w:sz w:val="13"/>
+                      <w:szCs w:val="13"/>
+                    </w:rPr>
+                    <w:t xml:space="preserve">Homberger Straße 348  ·  0176 22923179</w:t>
+                  </w:r>
+                </w:p>
+              </w:tc>
+              <w:tc>
+                <w:tcPr>
+                  <w:tcW w:type="dxa" w:w="737"/>
+                  <w:tcBorders>
+                    <w:top w:val="none" w:color="FFFFFF" w:sz="0"/>
+                    <w:left w:val="none" w:color="FFFFFF" w:sz="0"/>
+                    <w:bottom w:val="none" w:color="FFFFFF" w:sz="0"/>
+                    <w:right w:val="none" w:color="FFFFFF" w:sz="0"/>
+                  </w:tcBorders>
+                  <w:tcMar>
+                    <w:top w:type="dxa" w:w="0"/>
+                    <w:left w:type="dxa" w:w="57"/>
+                    <w:bottom w:type="dxa" w:w="0"/>
+                    <w:right w:type="dxa" w:w="0"/>
+                  </w:tcMar>
+                  <w:vAlign w:val="center"/>
+                </w:tcPr>
+                <w:p>
+                  <w:pPr>
+                    <w:spacing w:after="0" w:before="0"/>
+                  </w:pPr>
+                  <w:r>
+                    <w:drawing>
+                      <wp:inline distT="0" distB="0" distL="0" distR="0">
+                        <wp:extent cx="3771900000" cy="3771900000"/>
+                        <wp:effectExtent t="0" r="0" b="0" l="0"/>
+                        <wp:docPr id="1" name="" descr="" title=""/>
+                        <wp:cNvGraphicFramePr>
+                          <a:graphicFrameLocks xmlns:a="http://schemas.openxmlformats.org/drawingml/2006/main" noChangeAspect="1"/>
+                        </wp:cNvGraphicFramePr>
+                        <a:graphic xmlns:a="http://schemas.openxmlformats.org/drawingml/2006/main">
+                          <a:graphicData uri="http://schemas.openxmlformats.org/drawingml/2006/picture">
+                            <pic:pic xmlns:pic="http://schemas.openxmlformats.org/drawingml/2006/picture">
+                              <pic:nvPicPr>
+                                <pic:cNvPr id="0" name="" descr=""/>
+                                <pic:cNvPicPr>
+                                  <a:picLocks noChangeAspect="1" noChangeArrowheads="1"/>
+                                </pic:cNvPicPr>
+                              </pic:nvPicPr>
+                              <pic:blipFill>
+                                <a:blip r:embed="rId8" cstate="none"/>
+                                <a:srcRect/>
+                                <a:stretch>
+                                  <a:fillRect/>
+                                </a:stretch>
+                              </pic:blipFill>
+                              <pic:spPr bwMode="auto">
+                                <a:xfrm>
+                                  <a:off x="0" y="0"/>
+                                  <a:ext cx="3771900000" cy="3771900000"/>
+                                </a:xfrm>
+                                <a:prstGeom prst="rect">
+                                  <a:avLst/>
+                                </a:prstGeom>
+                              </pic:spPr>
+                            </pic:pic>
+                          </a:graphicData>
+                        </a:graphic>
+                      </wp:inline>
+                    </w:drawing>
+                  </w:r>
+                </w:p>
+              </w:tc>
+            </w:tr>
+          </w:tbl>
+          <w:p/>
         </w:tc>
       </w:tr>
       <w:tr>
@@ -353,54 +749,145 @@
             </w:tcMar>
             <w:vAlign w:val="top"/>
           </w:tcPr>
-          <w:p>
-            <w:pPr>
-              <w:spacing w:after="85" w:before="0"/>
-            </w:pPr>
-            <w:r>
-              <w:drawing>
-                <wp:inline distT="0" distB="0" distL="0" distR="0">
-                  <wp:extent cx="15087600000" cy="10058400000"/>
-                  <wp:effectExtent t="0" r="0" b="0" l="0"/>
-                  <wp:docPr id="1" name="" descr="" title=""/>
-                  <wp:cNvGraphicFramePr>
-                    <a:graphicFrameLocks xmlns:a="http://schemas.openxmlformats.org/drawingml/2006/main" noChangeAspect="1"/>
-                  </wp:cNvGraphicFramePr>
-                  <a:graphic xmlns:a="http://schemas.openxmlformats.org/drawingml/2006/main">
-                    <a:graphicData uri="http://schemas.openxmlformats.org/drawingml/2006/picture">
-                      <pic:pic xmlns:pic="http://schemas.openxmlformats.org/drawingml/2006/picture">
-                        <pic:nvPicPr>
-                          <pic:cNvPr id="0" name="" descr=""/>
-                          <pic:cNvPicPr>
-                            <a:picLocks noChangeAspect="1" noChangeArrowheads="1"/>
-                          </pic:cNvPicPr>
-                        </pic:nvPicPr>
-                        <pic:blipFill>
-                          <a:blip r:embed="rId7" cstate="none"/>
-                          <a:srcRect/>
-                          <a:stretch>
-                            <a:fillRect/>
-                          </a:stretch>
-                        </pic:blipFill>
-                        <pic:spPr bwMode="auto">
-                          <a:xfrm>
-                            <a:off x="0" y="0"/>
-                            <a:ext cx="15087600000" cy="10058400000"/>
-                          </a:xfrm>
-                          <a:prstGeom prst="rect">
-                            <a:avLst/>
-                          </a:prstGeom>
-                        </pic:spPr>
-                      </pic:pic>
-                    </a:graphicData>
-                  </a:graphic>
-                </wp:inline>
-              </w:drawing>
-            </w:r>
-          </w:p>
-          <w:p>
-            <w:pPr>
-              <w:spacing w:after="113" w:before="0"/>
+          <w:tbl>
+            <w:tblPr>
+              <w:tblW w:type="dxa" w:w="4423"/>
+              <w:tblBorders>
+                <w:top w:val="none" w:color="FFFFFF" w:sz="0"/>
+                <w:left w:val="none" w:color="FFFFFF" w:sz="0"/>
+                <w:bottom w:val="none" w:color="FFFFFF" w:sz="0"/>
+                <w:right w:val="none" w:color="FFFFFF" w:sz="0"/>
+                <w:insideH w:val="single" w:color="auto" w:sz="4"/>
+                <w:insideV w:val="single" w:color="auto" w:sz="4"/>
+              </w:tblBorders>
+            </w:tblPr>
+            <w:tblGrid>
+              <w:gridCol w:w="2156"/>
+              <w:gridCol w:w="2154"/>
+            </w:tblGrid>
+            <w:tr>
+              <w:tc>
+                <w:tcPr>
+                  <w:tcW w:type="dxa" w:w="2156"/>
+                  <w:tcBorders>
+                    <w:top w:val="none" w:color="FFFFFF" w:sz="0"/>
+                    <w:left w:val="none" w:color="FFFFFF" w:sz="0"/>
+                    <w:bottom w:val="none" w:color="FFFFFF" w:sz="0"/>
+                    <w:right w:val="none" w:color="FFFFFF" w:sz="0"/>
+                  </w:tcBorders>
+                  <w:tcMar>
+                    <w:top w:type="dxa" w:w="0"/>
+                    <w:left w:type="dxa" w:w="0"/>
+                    <w:bottom w:type="dxa" w:w="0"/>
+                    <w:right w:type="dxa" w:w="0"/>
+                  </w:tcMar>
+                  <w:vAlign w:val="center"/>
+                </w:tcPr>
+                <w:p>
+                  <w:pPr>
+                    <w:spacing w:after="0" w:before="0"/>
+                  </w:pPr>
+                  <w:r>
+                    <w:drawing>
+                      <wp:inline distT="0" distB="0" distL="0" distR="0">
+                        <wp:extent cx="15087600000" cy="10058400000"/>
+                        <wp:effectExtent t="0" r="0" b="0" l="0"/>
+                        <wp:docPr id="1" name="" descr="" title=""/>
+                        <wp:cNvGraphicFramePr>
+                          <a:graphicFrameLocks xmlns:a="http://schemas.openxmlformats.org/drawingml/2006/main" noChangeAspect="1"/>
+                        </wp:cNvGraphicFramePr>
+                        <a:graphic xmlns:a="http://schemas.openxmlformats.org/drawingml/2006/main">
+                          <a:graphicData uri="http://schemas.openxmlformats.org/drawingml/2006/picture">
+                            <pic:pic xmlns:pic="http://schemas.openxmlformats.org/drawingml/2006/picture">
+                              <pic:nvPicPr>
+                                <pic:cNvPr id="0" name="" descr=""/>
+                                <pic:cNvPicPr>
+                                  <a:picLocks noChangeAspect="1" noChangeArrowheads="1"/>
+                                </pic:cNvPicPr>
+                              </pic:nvPicPr>
+                              <pic:blipFill>
+                                <a:blip r:embed="rId7" cstate="none"/>
+                                <a:srcRect/>
+                                <a:stretch>
+                                  <a:fillRect/>
+                                </a:stretch>
+                              </pic:blipFill>
+                              <pic:spPr bwMode="auto">
+                                <a:xfrm>
+                                  <a:off x="0" y="0"/>
+                                  <a:ext cx="15087600000" cy="10058400000"/>
+                                </a:xfrm>
+                                <a:prstGeom prst="rect">
+                                  <a:avLst/>
+                                </a:prstGeom>
+                              </pic:spPr>
+                            </pic:pic>
+                          </a:graphicData>
+                        </a:graphic>
+                      </wp:inline>
+                    </w:drawing>
+                  </w:r>
+                </w:p>
+              </w:tc>
+              <w:tc>
+                <w:tcPr>
+                  <w:tcW w:type="dxa" w:w="2154"/>
+                  <w:tcBorders>
+                    <w:top w:val="none" w:color="FFFFFF" w:sz="0"/>
+                    <w:left w:val="none" w:color="FFFFFF" w:sz="0"/>
+                    <w:bottom w:val="none" w:color="FFFFFF" w:sz="0"/>
+                    <w:right w:val="none" w:color="FFFFFF" w:sz="0"/>
+                  </w:tcBorders>
+                  <w:tcMar>
+                    <w:top w:type="dxa" w:w="0"/>
+                    <w:left w:type="dxa" w:w="113"/>
+                    <w:bottom w:type="dxa" w:w="0"/>
+                    <w:right w:type="dxa" w:w="0"/>
+                  </w:tcMar>
+                  <w:vAlign w:val="center"/>
+                </w:tcPr>
+                <w:p>
+                  <w:pPr>
+                    <w:spacing w:after="45" w:before="0"/>
+                    <w:jc w:val="right"/>
+                  </w:pPr>
+                  <w:r>
+                    <w:rPr>
+                      <w:color w:val="1A6374"/>
+                      <w:sz w:val="11"/>
+                      <w:szCs w:val="11"/>
+                    </w:rPr>
+                    <w:t xml:space="preserve">naturheilpraxis-hilfreich.de</w:t>
+                  </w:r>
+                </w:p>
+                <w:p>
+                  <w:pPr>
+                    <w:spacing w:after="0" w:before="0"/>
+                    <w:jc w:val="right"/>
+                  </w:pPr>
+                  <w:r>
+                    <w:rPr>
+                      <w:color w:val="1A6374"/>
+                      <w:sz w:val="11"/>
+                      <w:szCs w:val="11"/>
+                    </w:rPr>
+                    <w:t xml:space="preserve">info@naturheilpraxis-hilfreich.de</w:t>
+                  </w:r>
+                </w:p>
+              </w:tc>
+            </w:tr>
+          </w:tbl>
+          <w:p>
+            <w:pPr>
+              <w:pBdr>
+                <w:bottom w:val="single" w:color="DDD5C8" w:sz="2" w:space="1"/>
+              </w:pBdr>
+              <w:spacing w:after="0" w:before="85"/>
+            </w:pPr>
+          </w:p>
+          <w:p>
+            <w:pPr>
+              <w:spacing w:after="113" w:before="113"/>
             </w:pPr>
             <w:r>
               <w:rPr>
@@ -455,7 +942,7 @@
           <w:p>
             <w:pPr>
               <w:pBdr>
-                <w:bottom w:val="single" w:color="B08850" w:sz="3" w:space="3"/>
+                <w:bottom w:val="single" w:color="B08850" w:sz="3" w:space="2"/>
               </w:pBdr>
               <w:spacing w:after="85" w:before="0"/>
             </w:pPr>
@@ -470,19 +957,126 @@
               <w:t xml:space="preserve">Bei Verhinderung bitten wir um frühzeitige Absage.</w:t>
             </w:r>
           </w:p>
-          <w:p>
-            <w:pPr>
-              <w:spacing w:after="0" w:before="85"/>
-            </w:pPr>
-            <w:r>
-              <w:rPr>
-                <w:color w:val="7E7568"/>
-                <w:sz w:val="13"/>
-                <w:szCs w:val="13"/>
-              </w:rPr>
-              <w:t xml:space="preserve">Homberger Straße 348  ·  0176 22923179</w:t>
-            </w:r>
-          </w:p>
+          <w:tbl>
+            <w:tblPr>
+              <w:tblW w:type="dxa" w:w="4423"/>
+              <w:tblBorders>
+                <w:top w:val="none" w:color="FFFFFF" w:sz="0"/>
+                <w:left w:val="none" w:color="FFFFFF" w:sz="0"/>
+                <w:bottom w:val="none" w:color="FFFFFF" w:sz="0"/>
+                <w:right w:val="none" w:color="FFFFFF" w:sz="0"/>
+                <w:insideH w:val="single" w:color="auto" w:sz="4"/>
+                <w:insideV w:val="single" w:color="auto" w:sz="4"/>
+              </w:tblBorders>
+              <w:tblCellMar>
+                <w:top w:type="dxa" w:w="85"/>
+                <w:left w:type="dxa" w:w="0"/>
+                <w:bottom w:type="dxa" w:w="0"/>
+                <w:right w:type="dxa" w:w="0"/>
+              </w:tblCellMar>
+            </w:tblPr>
+            <w:tblGrid>
+              <w:gridCol w:w="3686"/>
+              <w:gridCol w:w="737"/>
+            </w:tblGrid>
+            <w:tr>
+              <w:tc>
+                <w:tcPr>
+                  <w:tcW w:type="dxa" w:w="3686"/>
+                  <w:tcBorders>
+                    <w:top w:val="none" w:color="FFFFFF" w:sz="0"/>
+                    <w:left w:val="none" w:color="FFFFFF" w:sz="0"/>
+                    <w:bottom w:val="none" w:color="FFFFFF" w:sz="0"/>
+                    <w:right w:val="none" w:color="FFFFFF" w:sz="0"/>
+                  </w:tcBorders>
+                  <w:tcMar>
+                    <w:top w:type="dxa" w:w="0"/>
+                    <w:left w:type="dxa" w:w="0"/>
+                    <w:bottom w:type="dxa" w:w="0"/>
+                    <w:right w:type="dxa" w:w="0"/>
+                  </w:tcMar>
+                  <w:vAlign w:val="center"/>
+                </w:tcPr>
+                <w:p>
+                  <w:pPr>
+                    <w:spacing w:after="0" w:before="0"/>
+                  </w:pPr>
+                  <w:r>
+                    <w:rPr>
+                      <w:color w:val="7E7568"/>
+                      <w:sz w:val="13"/>
+                      <w:szCs w:val="13"/>
+                    </w:rPr>
+                    <w:t xml:space="preserve">Homberger Straße 348  ·  0176 22923179</w:t>
+                  </w:r>
+                </w:p>
+              </w:tc>
+              <w:tc>
+                <w:tcPr>
+                  <w:tcW w:type="dxa" w:w="737"/>
+                  <w:tcBorders>
+                    <w:top w:val="none" w:color="FFFFFF" w:sz="0"/>
+                    <w:left w:val="none" w:color="FFFFFF" w:sz="0"/>
+                    <w:bottom w:val="none" w:color="FFFFFF" w:sz="0"/>
+                    <w:right w:val="none" w:color="FFFFFF" w:sz="0"/>
+                  </w:tcBorders>
+                  <w:tcMar>
+                    <w:top w:type="dxa" w:w="0"/>
+                    <w:left w:type="dxa" w:w="57"/>
+                    <w:bottom w:type="dxa" w:w="0"/>
+                    <w:right w:type="dxa" w:w="0"/>
+                  </w:tcMar>
+                  <w:vAlign w:val="center"/>
+                </w:tcPr>
+                <w:p>
+                  <w:pPr>
+                    <w:spacing w:after="0" w:before="0"/>
+                  </w:pPr>
+                  <w:r>
+                    <w:drawing>
+                      <wp:inline distT="0" distB="0" distL="0" distR="0">
+                        <wp:extent cx="3771900000" cy="3771900000"/>
+                        <wp:effectExtent t="0" r="0" b="0" l="0"/>
+                        <wp:docPr id="1" name="" descr="" title=""/>
+                        <wp:cNvGraphicFramePr>
+                          <a:graphicFrameLocks xmlns:a="http://schemas.openxmlformats.org/drawingml/2006/main" noChangeAspect="1"/>
+                        </wp:cNvGraphicFramePr>
+                        <a:graphic xmlns:a="http://schemas.openxmlformats.org/drawingml/2006/main">
+                          <a:graphicData uri="http://schemas.openxmlformats.org/drawingml/2006/picture">
+                            <pic:pic xmlns:pic="http://schemas.openxmlformats.org/drawingml/2006/picture">
+                              <pic:nvPicPr>
+                                <pic:cNvPr id="0" name="" descr=""/>
+                                <pic:cNvPicPr>
+                                  <a:picLocks noChangeAspect="1" noChangeArrowheads="1"/>
+                                </pic:cNvPicPr>
+                              </pic:nvPicPr>
+                              <pic:blipFill>
+                                <a:blip r:embed="rId8" cstate="none"/>
+                                <a:srcRect/>
+                                <a:stretch>
+                                  <a:fillRect/>
+                                </a:stretch>
+                              </pic:blipFill>
+                              <pic:spPr bwMode="auto">
+                                <a:xfrm>
+                                  <a:off x="0" y="0"/>
+                                  <a:ext cx="3771900000" cy="3771900000"/>
+                                </a:xfrm>
+                                <a:prstGeom prst="rect">
+                                  <a:avLst/>
+                                </a:prstGeom>
+                              </pic:spPr>
+                            </pic:pic>
+                          </a:graphicData>
+                        </a:graphic>
+                      </wp:inline>
+                    </w:drawing>
+                  </w:r>
+                </w:p>
+              </w:tc>
+            </w:tr>
+          </w:tbl>
+          <w:p/>
         </w:tc>
         <w:tc>
           <w:tcPr>
@@ -513,54 +1107,145 @@
             </w:tcMar>
             <w:vAlign w:val="top"/>
           </w:tcPr>
-          <w:p>
-            <w:pPr>
-              <w:spacing w:after="85" w:before="0"/>
-            </w:pPr>
-            <w:r>
-              <w:drawing>
-                <wp:inline distT="0" distB="0" distL="0" distR="0">
-                  <wp:extent cx="15087600000" cy="10058400000"/>
-                  <wp:effectExtent t="0" r="0" b="0" l="0"/>
-                  <wp:docPr id="1" name="" descr="" title=""/>
-                  <wp:cNvGraphicFramePr>
-                    <a:graphicFrameLocks xmlns:a="http://schemas.openxmlformats.org/drawingml/2006/main" noChangeAspect="1"/>
-                  </wp:cNvGraphicFramePr>
-                  <a:graphic xmlns:a="http://schemas.openxmlformats.org/drawingml/2006/main">
-                    <a:graphicData uri="http://schemas.openxmlformats.org/drawingml/2006/picture">
-                      <pic:pic xmlns:pic="http://schemas.openxmlformats.org/drawingml/2006/picture">
-                        <pic:nvPicPr>
-                          <pic:cNvPr id="0" name="" descr=""/>
-                          <pic:cNvPicPr>
-                            <a:picLocks noChangeAspect="1" noChangeArrowheads="1"/>
-                          </pic:cNvPicPr>
-                        </pic:nvPicPr>
-                        <pic:blipFill>
-                          <a:blip r:embed="rId7" cstate="none"/>
-                          <a:srcRect/>
-                          <a:stretch>
-                            <a:fillRect/>
-                          </a:stretch>
-                        </pic:blipFill>
-                        <pic:spPr bwMode="auto">
-                          <a:xfrm>
-                            <a:off x="0" y="0"/>
-                            <a:ext cx="15087600000" cy="10058400000"/>
-                          </a:xfrm>
-                          <a:prstGeom prst="rect">
-                            <a:avLst/>
-                          </a:prstGeom>
-                        </pic:spPr>
-                      </pic:pic>
-                    </a:graphicData>
-                  </a:graphic>
-                </wp:inline>
-              </w:drawing>
-            </w:r>
-          </w:p>
-          <w:p>
-            <w:pPr>
-              <w:spacing w:after="113" w:before="0"/>
+          <w:tbl>
+            <w:tblPr>
+              <w:tblW w:type="dxa" w:w="4423"/>
+              <w:tblBorders>
+                <w:top w:val="none" w:color="FFFFFF" w:sz="0"/>
+                <w:left w:val="none" w:color="FFFFFF" w:sz="0"/>
+                <w:bottom w:val="none" w:color="FFFFFF" w:sz="0"/>
+                <w:right w:val="none" w:color="FFFFFF" w:sz="0"/>
+                <w:insideH w:val="single" w:color="auto" w:sz="4"/>
+                <w:insideV w:val="single" w:color="auto" w:sz="4"/>
+              </w:tblBorders>
+            </w:tblPr>
+            <w:tblGrid>
+              <w:gridCol w:w="2156"/>
+              <w:gridCol w:w="2154"/>
+            </w:tblGrid>
+            <w:tr>
+              <w:tc>
+                <w:tcPr>
+                  <w:tcW w:type="dxa" w:w="2156"/>
+                  <w:tcBorders>
+                    <w:top w:val="none" w:color="FFFFFF" w:sz="0"/>
+                    <w:left w:val="none" w:color="FFFFFF" w:sz="0"/>
+                    <w:bottom w:val="none" w:color="FFFFFF" w:sz="0"/>
+                    <w:right w:val="none" w:color="FFFFFF" w:sz="0"/>
+                  </w:tcBorders>
+                  <w:tcMar>
+                    <w:top w:type="dxa" w:w="0"/>
+                    <w:left w:type="dxa" w:w="0"/>
+                    <w:bottom w:type="dxa" w:w="0"/>
+                    <w:right w:type="dxa" w:w="0"/>
+                  </w:tcMar>
+                  <w:vAlign w:val="center"/>
+                </w:tcPr>
+                <w:p>
+                  <w:pPr>
+                    <w:spacing w:after="0" w:before="0"/>
+                  </w:pPr>
+                  <w:r>
+                    <w:drawing>
+                      <wp:inline distT="0" distB="0" distL="0" distR="0">
+                        <wp:extent cx="15087600000" cy="10058400000"/>
+                        <wp:effectExtent t="0" r="0" b="0" l="0"/>
+                        <wp:docPr id="1" name="" descr="" title=""/>
+                        <wp:cNvGraphicFramePr>
+                          <a:graphicFrameLocks xmlns:a="http://schemas.openxmlformats.org/drawingml/2006/main" noChangeAspect="1"/>
+                        </wp:cNvGraphicFramePr>
+                        <a:graphic xmlns:a="http://schemas.openxmlformats.org/drawingml/2006/main">
+                          <a:graphicData uri="http://schemas.openxmlformats.org/drawingml/2006/picture">
+                            <pic:pic xmlns:pic="http://schemas.openxmlformats.org/drawingml/2006/picture">
+                              <pic:nvPicPr>
+                                <pic:cNvPr id="0" name="" descr=""/>
+                                <pic:cNvPicPr>
+                                  <a:picLocks noChangeAspect="1" noChangeArrowheads="1"/>
+                                </pic:cNvPicPr>
+                              </pic:nvPicPr>
+                              <pic:blipFill>
+                                <a:blip r:embed="rId7" cstate="none"/>
+                                <a:srcRect/>
+                                <a:stretch>
+                                  <a:fillRect/>
+                                </a:stretch>
+                              </pic:blipFill>
+                              <pic:spPr bwMode="auto">
+                                <a:xfrm>
+                                  <a:off x="0" y="0"/>
+                                  <a:ext cx="15087600000" cy="10058400000"/>
+                                </a:xfrm>
+                                <a:prstGeom prst="rect">
+                                  <a:avLst/>
+                                </a:prstGeom>
+                              </pic:spPr>
+                            </pic:pic>
+                          </a:graphicData>
+                        </a:graphic>
+                      </wp:inline>
+                    </w:drawing>
+                  </w:r>
+                </w:p>
+              </w:tc>
+              <w:tc>
+                <w:tcPr>
+                  <w:tcW w:type="dxa" w:w="2154"/>
+                  <w:tcBorders>
+                    <w:top w:val="none" w:color="FFFFFF" w:sz="0"/>
+                    <w:left w:val="none" w:color="FFFFFF" w:sz="0"/>
+                    <w:bottom w:val="none" w:color="FFFFFF" w:sz="0"/>
+                    <w:right w:val="none" w:color="FFFFFF" w:sz="0"/>
+                  </w:tcBorders>
+                  <w:tcMar>
+                    <w:top w:type="dxa" w:w="0"/>
+                    <w:left w:type="dxa" w:w="113"/>
+                    <w:bottom w:type="dxa" w:w="0"/>
+                    <w:right w:type="dxa" w:w="0"/>
+                  </w:tcMar>
+                  <w:vAlign w:val="center"/>
+                </w:tcPr>
+                <w:p>
+                  <w:pPr>
+                    <w:spacing w:after="45" w:before="0"/>
+                    <w:jc w:val="right"/>
+                  </w:pPr>
+                  <w:r>
+                    <w:rPr>
+                      <w:color w:val="1A6374"/>
+                      <w:sz w:val="11"/>
+                      <w:szCs w:val="11"/>
+                    </w:rPr>
+                    <w:t xml:space="preserve">naturheilpraxis-hilfreich.de</w:t>
+                  </w:r>
+                </w:p>
+                <w:p>
+                  <w:pPr>
+                    <w:spacing w:after="0" w:before="0"/>
+                    <w:jc w:val="right"/>
+                  </w:pPr>
+                  <w:r>
+                    <w:rPr>
+                      <w:color w:val="1A6374"/>
+                      <w:sz w:val="11"/>
+                      <w:szCs w:val="11"/>
+                    </w:rPr>
+                    <w:t xml:space="preserve">info@naturheilpraxis-hilfreich.de</w:t>
+                  </w:r>
+                </w:p>
+              </w:tc>
+            </w:tr>
+          </w:tbl>
+          <w:p>
+            <w:pPr>
+              <w:pBdr>
+                <w:bottom w:val="single" w:color="DDD5C8" w:sz="2" w:space="1"/>
+              </w:pBdr>
+              <w:spacing w:after="0" w:before="85"/>
+            </w:pPr>
+          </w:p>
+          <w:p>
+            <w:pPr>
+              <w:spacing w:after="113" w:before="113"/>
             </w:pPr>
             <w:r>
               <w:rPr>
@@ -615,7 +1300,7 @@
           <w:p>
             <w:pPr>
               <w:pBdr>
-                <w:bottom w:val="single" w:color="B08850" w:sz="3" w:space="3"/>
+                <w:bottom w:val="single" w:color="B08850" w:sz="3" w:space="2"/>
               </w:pBdr>
               <w:spacing w:after="85" w:before="0"/>
             </w:pPr>
@@ -630,19 +1315,126 @@
               <w:t xml:space="preserve">Bei Verhinderung bitten wir um frühzeitige Absage.</w:t>
             </w:r>
           </w:p>
-          <w:p>
-            <w:pPr>
-              <w:spacing w:after="0" w:before="85"/>
-            </w:pPr>
-            <w:r>
-              <w:rPr>
-                <w:color w:val="7E7568"/>
-                <w:sz w:val="13"/>
-                <w:szCs w:val="13"/>
-              </w:rPr>
-              <w:t xml:space="preserve">Homberger Straße 348  ·  0176 22923179</w:t>
-            </w:r>
-          </w:p>
+          <w:tbl>
+            <w:tblPr>
+              <w:tblW w:type="dxa" w:w="4423"/>
+              <w:tblBorders>
+                <w:top w:val="none" w:color="FFFFFF" w:sz="0"/>
+                <w:left w:val="none" w:color="FFFFFF" w:sz="0"/>
+                <w:bottom w:val="none" w:color="FFFFFF" w:sz="0"/>
+                <w:right w:val="none" w:color="FFFFFF" w:sz="0"/>
+                <w:insideH w:val="single" w:color="auto" w:sz="4"/>
+                <w:insideV w:val="single" w:color="auto" w:sz="4"/>
+              </w:tblBorders>
+              <w:tblCellMar>
+                <w:top w:type="dxa" w:w="85"/>
+                <w:left w:type="dxa" w:w="0"/>
+                <w:bottom w:type="dxa" w:w="0"/>
+                <w:right w:type="dxa" w:w="0"/>
+              </w:tblCellMar>
+            </w:tblPr>
+            <w:tblGrid>
+              <w:gridCol w:w="3686"/>
+              <w:gridCol w:w="737"/>
+            </w:tblGrid>
+            <w:tr>
+              <w:tc>
+                <w:tcPr>
+                  <w:tcW w:type="dxa" w:w="3686"/>
+                  <w:tcBorders>
+                    <w:top w:val="none" w:color="FFFFFF" w:sz="0"/>
+                    <w:left w:val="none" w:color="FFFFFF" w:sz="0"/>
+                    <w:bottom w:val="none" w:color="FFFFFF" w:sz="0"/>
+                    <w:right w:val="none" w:color="FFFFFF" w:sz="0"/>
+                  </w:tcBorders>
+                  <w:tcMar>
+                    <w:top w:type="dxa" w:w="0"/>
+                    <w:left w:type="dxa" w:w="0"/>
+                    <w:bottom w:type="dxa" w:w="0"/>
+                    <w:right w:type="dxa" w:w="0"/>
+                  </w:tcMar>
+                  <w:vAlign w:val="center"/>
+                </w:tcPr>
+                <w:p>
+                  <w:pPr>
+                    <w:spacing w:after="0" w:before="0"/>
+                  </w:pPr>
+                  <w:r>
+                    <w:rPr>
+                      <w:color w:val="7E7568"/>
+                      <w:sz w:val="13"/>
+                      <w:szCs w:val="13"/>
+                    </w:rPr>
+                    <w:t xml:space="preserve">Homberger Straße 348  ·  0176 22923179</w:t>
+                  </w:r>
+                </w:p>
+              </w:tc>
+              <w:tc>
+                <w:tcPr>
+                  <w:tcW w:type="dxa" w:w="737"/>
+                  <w:tcBorders>
+                    <w:top w:val="none" w:color="FFFFFF" w:sz="0"/>
+                    <w:left w:val="none" w:color="FFFFFF" w:sz="0"/>
+                    <w:bottom w:val="none" w:color="FFFFFF" w:sz="0"/>
+                    <w:right w:val="none" w:color="FFFFFF" w:sz="0"/>
+                  </w:tcBorders>
+                  <w:tcMar>
+                    <w:top w:type="dxa" w:w="0"/>
+                    <w:left w:type="dxa" w:w="57"/>
+                    <w:bottom w:type="dxa" w:w="0"/>
+                    <w:right w:type="dxa" w:w="0"/>
+                  </w:tcMar>
+                  <w:vAlign w:val="center"/>
+                </w:tcPr>
+                <w:p>
+                  <w:pPr>
+                    <w:spacing w:after="0" w:before="0"/>
+                  </w:pPr>
+                  <w:r>
+                    <w:drawing>
+                      <wp:inline distT="0" distB="0" distL="0" distR="0">
+                        <wp:extent cx="3771900000" cy="3771900000"/>
+                        <wp:effectExtent t="0" r="0" b="0" l="0"/>
+                        <wp:docPr id="1" name="" descr="" title=""/>
+                        <wp:cNvGraphicFramePr>
+                          <a:graphicFrameLocks xmlns:a="http://schemas.openxmlformats.org/drawingml/2006/main" noChangeAspect="1"/>
+                        </wp:cNvGraphicFramePr>
+                        <a:graphic xmlns:a="http://schemas.openxmlformats.org/drawingml/2006/main">
+                          <a:graphicData uri="http://schemas.openxmlformats.org/drawingml/2006/picture">
+                            <pic:pic xmlns:pic="http://schemas.openxmlformats.org/drawingml/2006/picture">
+                              <pic:nvPicPr>
+                                <pic:cNvPr id="0" name="" descr=""/>
+                                <pic:cNvPicPr>
+                                  <a:picLocks noChangeAspect="1" noChangeArrowheads="1"/>
+                                </pic:cNvPicPr>
+                              </pic:nvPicPr>
+                              <pic:blipFill>
+                                <a:blip r:embed="rId8" cstate="none"/>
+                                <a:srcRect/>
+                                <a:stretch>
+                                  <a:fillRect/>
+                                </a:stretch>
+                              </pic:blipFill>
+                              <pic:spPr bwMode="auto">
+                                <a:xfrm>
+                                  <a:off x="0" y="0"/>
+                                  <a:ext cx="3771900000" cy="3771900000"/>
+                                </a:xfrm>
+                                <a:prstGeom prst="rect">
+                                  <a:avLst/>
+                                </a:prstGeom>
+                              </pic:spPr>
+                            </pic:pic>
+                          </a:graphicData>
+                        </a:graphic>
+                      </wp:inline>
+                    </w:drawing>
+                  </w:r>
+                </w:p>
+              </w:tc>
+            </w:tr>
+          </w:tbl>
+          <w:p/>
         </w:tc>
       </w:tr>
       <w:tr>
@@ -666,54 +1458,145 @@
             </w:tcMar>
             <w:vAlign w:val="top"/>
           </w:tcPr>
-          <w:p>
-            <w:pPr>
-              <w:spacing w:after="85" w:before="0"/>
-            </w:pPr>
-            <w:r>
-              <w:drawing>
-                <wp:inline distT="0" distB="0" distL="0" distR="0">
-                  <wp:extent cx="15087600000" cy="10058400000"/>
-                  <wp:effectExtent t="0" r="0" b="0" l="0"/>
-                  <wp:docPr id="1" name="" descr="" title=""/>
-                  <wp:cNvGraphicFramePr>
-                    <a:graphicFrameLocks xmlns:a="http://schemas.openxmlformats.org/drawingml/2006/main" noChangeAspect="1"/>
-                  </wp:cNvGraphicFramePr>
-                  <a:graphic xmlns:a="http://schemas.openxmlformats.org/drawingml/2006/main">
-                    <a:graphicData uri="http://schemas.openxmlformats.org/drawingml/2006/picture">
-                      <pic:pic xmlns:pic="http://schemas.openxmlformats.org/drawingml/2006/picture">
-                        <pic:nvPicPr>
-                          <pic:cNvPr id="0" name="" descr=""/>
-                          <pic:cNvPicPr>
-                            <a:picLocks noChangeAspect="1" noChangeArrowheads="1"/>
-                          </pic:cNvPicPr>
-                        </pic:nvPicPr>
-                        <pic:blipFill>
-                          <a:blip r:embed="rId7" cstate="none"/>
-                          <a:srcRect/>
-                          <a:stretch>
-                            <a:fillRect/>
-                          </a:stretch>
-                        </pic:blipFill>
-                        <pic:spPr bwMode="auto">
-                          <a:xfrm>
-                            <a:off x="0" y="0"/>
-                            <a:ext cx="15087600000" cy="10058400000"/>
-                          </a:xfrm>
-                          <a:prstGeom prst="rect">
-                            <a:avLst/>
-                          </a:prstGeom>
-                        </pic:spPr>
-                      </pic:pic>
-                    </a:graphicData>
-                  </a:graphic>
-                </wp:inline>
-              </w:drawing>
-            </w:r>
-          </w:p>
-          <w:p>
-            <w:pPr>
-              <w:spacing w:after="113" w:before="0"/>
+          <w:tbl>
+            <w:tblPr>
+              <w:tblW w:type="dxa" w:w="4423"/>
+              <w:tblBorders>
+                <w:top w:val="none" w:color="FFFFFF" w:sz="0"/>
+                <w:left w:val="none" w:color="FFFFFF" w:sz="0"/>
+                <w:bottom w:val="none" w:color="FFFFFF" w:sz="0"/>
+                <w:right w:val="none" w:color="FFFFFF" w:sz="0"/>
+                <w:insideH w:val="single" w:color="auto" w:sz="4"/>
+                <w:insideV w:val="single" w:color="auto" w:sz="4"/>
+              </w:tblBorders>
+            </w:tblPr>
+            <w:tblGrid>
+              <w:gridCol w:w="2156"/>
+              <w:gridCol w:w="2154"/>
+            </w:tblGrid>
+            <w:tr>
+              <w:tc>
+                <w:tcPr>
+                  <w:tcW w:type="dxa" w:w="2156"/>
+                  <w:tcBorders>
+                    <w:top w:val="none" w:color="FFFFFF" w:sz="0"/>
+                    <w:left w:val="none" w:color="FFFFFF" w:sz="0"/>
+                    <w:bottom w:val="none" w:color="FFFFFF" w:sz="0"/>
+                    <w:right w:val="none" w:color="FFFFFF" w:sz="0"/>
+                  </w:tcBorders>
+                  <w:tcMar>
+                    <w:top w:type="dxa" w:w="0"/>
+                    <w:left w:type="dxa" w:w="0"/>
+                    <w:bottom w:type="dxa" w:w="0"/>
+                    <w:right w:type="dxa" w:w="0"/>
+                  </w:tcMar>
+                  <w:vAlign w:val="center"/>
+                </w:tcPr>
+                <w:p>
+                  <w:pPr>
+                    <w:spacing w:after="0" w:before="0"/>
+                  </w:pPr>
+                  <w:r>
+                    <w:drawing>
+                      <wp:inline distT="0" distB="0" distL="0" distR="0">
+                        <wp:extent cx="15087600000" cy="10058400000"/>
+                        <wp:effectExtent t="0" r="0" b="0" l="0"/>
+                        <wp:docPr id="1" name="" descr="" title=""/>
+                        <wp:cNvGraphicFramePr>
+                          <a:graphicFrameLocks xmlns:a="http://schemas.openxmlformats.org/drawingml/2006/main" noChangeAspect="1"/>
+                        </wp:cNvGraphicFramePr>
+                        <a:graphic xmlns:a="http://schemas.openxmlformats.org/drawingml/2006/main">
+                          <a:graphicData uri="http://schemas.openxmlformats.org/drawingml/2006/picture">
+                            <pic:pic xmlns:pic="http://schemas.openxmlformats.org/drawingml/2006/picture">
+                              <pic:nvPicPr>
+                                <pic:cNvPr id="0" name="" descr=""/>
+                                <pic:cNvPicPr>
+                                  <a:picLocks noChangeAspect="1" noChangeArrowheads="1"/>
+                                </pic:cNvPicPr>
+                              </pic:nvPicPr>
+                              <pic:blipFill>
+                                <a:blip r:embed="rId7" cstate="none"/>
+                                <a:srcRect/>
+                                <a:stretch>
+                                  <a:fillRect/>
+                                </a:stretch>
+                              </pic:blipFill>
+                              <pic:spPr bwMode="auto">
+                                <a:xfrm>
+                                  <a:off x="0" y="0"/>
+                                  <a:ext cx="15087600000" cy="10058400000"/>
+                                </a:xfrm>
+                                <a:prstGeom prst="rect">
+                                  <a:avLst/>
+                                </a:prstGeom>
+                              </pic:spPr>
+                            </pic:pic>
+                          </a:graphicData>
+                        </a:graphic>
+                      </wp:inline>
+                    </w:drawing>
+                  </w:r>
+                </w:p>
+              </w:tc>
+              <w:tc>
+                <w:tcPr>
+                  <w:tcW w:type="dxa" w:w="2154"/>
+                  <w:tcBorders>
+                    <w:top w:val="none" w:color="FFFFFF" w:sz="0"/>
+                    <w:left w:val="none" w:color="FFFFFF" w:sz="0"/>
+                    <w:bottom w:val="none" w:color="FFFFFF" w:sz="0"/>
+                    <w:right w:val="none" w:color="FFFFFF" w:sz="0"/>
+                  </w:tcBorders>
+                  <w:tcMar>
+                    <w:top w:type="dxa" w:w="0"/>
+                    <w:left w:type="dxa" w:w="113"/>
+                    <w:bottom w:type="dxa" w:w="0"/>
+                    <w:right w:type="dxa" w:w="0"/>
+                  </w:tcMar>
+                  <w:vAlign w:val="center"/>
+                </w:tcPr>
+                <w:p>
+                  <w:pPr>
+                    <w:spacing w:after="45" w:before="0"/>
+                    <w:jc w:val="right"/>
+                  </w:pPr>
+                  <w:r>
+                    <w:rPr>
+                      <w:color w:val="1A6374"/>
+                      <w:sz w:val="11"/>
+                      <w:szCs w:val="11"/>
+                    </w:rPr>
+                    <w:t xml:space="preserve">naturheilpraxis-hilfreich.de</w:t>
+                  </w:r>
+                </w:p>
+                <w:p>
+                  <w:pPr>
+                    <w:spacing w:after="0" w:before="0"/>
+                    <w:jc w:val="right"/>
+                  </w:pPr>
+                  <w:r>
+                    <w:rPr>
+                      <w:color w:val="1A6374"/>
+                      <w:sz w:val="11"/>
+                      <w:szCs w:val="11"/>
+                    </w:rPr>
+                    <w:t xml:space="preserve">info@naturheilpraxis-hilfreich.de</w:t>
+                  </w:r>
+                </w:p>
+              </w:tc>
+            </w:tr>
+          </w:tbl>
+          <w:p>
+            <w:pPr>
+              <w:pBdr>
+                <w:bottom w:val="single" w:color="DDD5C8" w:sz="2" w:space="1"/>
+              </w:pBdr>
+              <w:spacing w:after="0" w:before="85"/>
+            </w:pPr>
+          </w:p>
+          <w:p>
+            <w:pPr>
+              <w:spacing w:after="113" w:before="113"/>
             </w:pPr>
             <w:r>
               <w:rPr>
@@ -768,7 +1651,7 @@
           <w:p>
             <w:pPr>
               <w:pBdr>
-                <w:bottom w:val="single" w:color="B08850" w:sz="3" w:space="3"/>
+                <w:bottom w:val="single" w:color="B08850" w:sz="3" w:space="2"/>
               </w:pBdr>
               <w:spacing w:after="85" w:before="0"/>
             </w:pPr>
@@ -783,19 +1666,126 @@
               <w:t xml:space="preserve">Bei Verhinderung bitten wir um frühzeitige Absage.</w:t>
             </w:r>
           </w:p>
-          <w:p>
-            <w:pPr>
-              <w:spacing w:after="0" w:before="85"/>
-            </w:pPr>
-            <w:r>
-              <w:rPr>
-                <w:color w:val="7E7568"/>
-                <w:sz w:val="13"/>
-                <w:szCs w:val="13"/>
-              </w:rPr>
-              <w:t xml:space="preserve">Homberger Straße 348  ·  0176 22923179</w:t>
-            </w:r>
-          </w:p>
+          <w:tbl>
+            <w:tblPr>
+              <w:tblW w:type="dxa" w:w="4423"/>
+              <w:tblBorders>
+                <w:top w:val="none" w:color="FFFFFF" w:sz="0"/>
+                <w:left w:val="none" w:color="FFFFFF" w:sz="0"/>
+                <w:bottom w:val="none" w:color="FFFFFF" w:sz="0"/>
+                <w:right w:val="none" w:color="FFFFFF" w:sz="0"/>
+                <w:insideH w:val="single" w:color="auto" w:sz="4"/>
+                <w:insideV w:val="single" w:color="auto" w:sz="4"/>
+              </w:tblBorders>
+              <w:tblCellMar>
+                <w:top w:type="dxa" w:w="85"/>
+                <w:left w:type="dxa" w:w="0"/>
+                <w:bottom w:type="dxa" w:w="0"/>
+                <w:right w:type="dxa" w:w="0"/>
+              </w:tblCellMar>
+            </w:tblPr>
+            <w:tblGrid>
+              <w:gridCol w:w="3686"/>
+              <w:gridCol w:w="737"/>
+            </w:tblGrid>
+            <w:tr>
+              <w:tc>
+                <w:tcPr>
+                  <w:tcW w:type="dxa" w:w="3686"/>
+                  <w:tcBorders>
+                    <w:top w:val="none" w:color="FFFFFF" w:sz="0"/>
+                    <w:left w:val="none" w:color="FFFFFF" w:sz="0"/>
+                    <w:bottom w:val="none" w:color="FFFFFF" w:sz="0"/>
+                    <w:right w:val="none" w:color="FFFFFF" w:sz="0"/>
+                  </w:tcBorders>
+                  <w:tcMar>
+                    <w:top w:type="dxa" w:w="0"/>
+                    <w:left w:type="dxa" w:w="0"/>
+                    <w:bottom w:type="dxa" w:w="0"/>
+                    <w:right w:type="dxa" w:w="0"/>
+                  </w:tcMar>
+                  <w:vAlign w:val="center"/>
+                </w:tcPr>
+                <w:p>
+                  <w:pPr>
+                    <w:spacing w:after="0" w:before="0"/>
+                  </w:pPr>
+                  <w:r>
+                    <w:rPr>
+                      <w:color w:val="7E7568"/>
+                      <w:sz w:val="13"/>
+                      <w:szCs w:val="13"/>
+                    </w:rPr>
+                    <w:t xml:space="preserve">Homberger Straße 348  ·  0176 22923179</w:t>
+                  </w:r>
+                </w:p>
+              </w:tc>
+              <w:tc>
+                <w:tcPr>
+                  <w:tcW w:type="dxa" w:w="737"/>
+                  <w:tcBorders>
+                    <w:top w:val="none" w:color="FFFFFF" w:sz="0"/>
+                    <w:left w:val="none" w:color="FFFFFF" w:sz="0"/>
+                    <w:bottom w:val="none" w:color="FFFFFF" w:sz="0"/>
+                    <w:right w:val="none" w:color="FFFFFF" w:sz="0"/>
+                  </w:tcBorders>
+                  <w:tcMar>
+                    <w:top w:type="dxa" w:w="0"/>
+                    <w:left w:type="dxa" w:w="57"/>
+                    <w:bottom w:type="dxa" w:w="0"/>
+                    <w:right w:type="dxa" w:w="0"/>
+                  </w:tcMar>
+                  <w:vAlign w:val="center"/>
+                </w:tcPr>
+                <w:p>
+                  <w:pPr>
+                    <w:spacing w:after="0" w:before="0"/>
+                  </w:pPr>
+                  <w:r>
+                    <w:drawing>
+                      <wp:inline distT="0" distB="0" distL="0" distR="0">
+                        <wp:extent cx="3771900000" cy="3771900000"/>
+                        <wp:effectExtent t="0" r="0" b="0" l="0"/>
+                        <wp:docPr id="1" name="" descr="" title=""/>
+                        <wp:cNvGraphicFramePr>
+                          <a:graphicFrameLocks xmlns:a="http://schemas.openxmlformats.org/drawingml/2006/main" noChangeAspect="1"/>
+                        </wp:cNvGraphicFramePr>
+                        <a:graphic xmlns:a="http://schemas.openxmlformats.org/drawingml/2006/main">
+                          <a:graphicData uri="http://schemas.openxmlformats.org/drawingml/2006/picture">
+                            <pic:pic xmlns:pic="http://schemas.openxmlformats.org/drawingml/2006/picture">
+                              <pic:nvPicPr>
+                                <pic:cNvPr id="0" name="" descr=""/>
+                                <pic:cNvPicPr>
+                                  <a:picLocks noChangeAspect="1" noChangeArrowheads="1"/>
+                                </pic:cNvPicPr>
+                              </pic:nvPicPr>
+                              <pic:blipFill>
+                                <a:blip r:embed="rId8" cstate="none"/>
+                                <a:srcRect/>
+                                <a:stretch>
+                                  <a:fillRect/>
+                                </a:stretch>
+                              </pic:blipFill>
+                              <pic:spPr bwMode="auto">
+                                <a:xfrm>
+                                  <a:off x="0" y="0"/>
+                                  <a:ext cx="3771900000" cy="3771900000"/>
+                                </a:xfrm>
+                                <a:prstGeom prst="rect">
+                                  <a:avLst/>
+                                </a:prstGeom>
+                              </pic:spPr>
+                            </pic:pic>
+                          </a:graphicData>
+                        </a:graphic>
+                      </wp:inline>
+                    </w:drawing>
+                  </w:r>
+                </w:p>
+              </w:tc>
+            </w:tr>
+          </w:tbl>
+          <w:p/>
         </w:tc>
         <w:tc>
           <w:tcPr>
@@ -826,54 +1816,145 @@
             </w:tcMar>
             <w:vAlign w:val="top"/>
           </w:tcPr>
-          <w:p>
-            <w:pPr>
-              <w:spacing w:after="85" w:before="0"/>
-            </w:pPr>
-            <w:r>
-              <w:drawing>
-                <wp:inline distT="0" distB="0" distL="0" distR="0">
-                  <wp:extent cx="15087600000" cy="10058400000"/>
-                  <wp:effectExtent t="0" r="0" b="0" l="0"/>
-                  <wp:docPr id="1" name="" descr="" title=""/>
-                  <wp:cNvGraphicFramePr>
-                    <a:graphicFrameLocks xmlns:a="http://schemas.openxmlformats.org/drawingml/2006/main" noChangeAspect="1"/>
-                  </wp:cNvGraphicFramePr>
-                  <a:graphic xmlns:a="http://schemas.openxmlformats.org/drawingml/2006/main">
-                    <a:graphicData uri="http://schemas.openxmlformats.org/drawingml/2006/picture">
-                      <pic:pic xmlns:pic="http://schemas.openxmlformats.org/drawingml/2006/picture">
-                        <pic:nvPicPr>
-                          <pic:cNvPr id="0" name="" descr=""/>
-                          <pic:cNvPicPr>
-                            <a:picLocks noChangeAspect="1" noChangeArrowheads="1"/>
-                          </pic:cNvPicPr>
-                        </pic:nvPicPr>
-                        <pic:blipFill>
-                          <a:blip r:embed="rId7" cstate="none"/>
-                          <a:srcRect/>
-                          <a:stretch>
-                            <a:fillRect/>
-                          </a:stretch>
-                        </pic:blipFill>
-                        <pic:spPr bwMode="auto">
-                          <a:xfrm>
-                            <a:off x="0" y="0"/>
-                            <a:ext cx="15087600000" cy="10058400000"/>
-                          </a:xfrm>
-                          <a:prstGeom prst="rect">
-                            <a:avLst/>
-                          </a:prstGeom>
-                        </pic:spPr>
-                      </pic:pic>
-                    </a:graphicData>
-                  </a:graphic>
-                </wp:inline>
-              </w:drawing>
-            </w:r>
-          </w:p>
-          <w:p>
-            <w:pPr>
-              <w:spacing w:after="113" w:before="0"/>
+          <w:tbl>
+            <w:tblPr>
+              <w:tblW w:type="dxa" w:w="4423"/>
+              <w:tblBorders>
+                <w:top w:val="none" w:color="FFFFFF" w:sz="0"/>
+                <w:left w:val="none" w:color="FFFFFF" w:sz="0"/>
+                <w:bottom w:val="none" w:color="FFFFFF" w:sz="0"/>
+                <w:right w:val="none" w:color="FFFFFF" w:sz="0"/>
+                <w:insideH w:val="single" w:color="auto" w:sz="4"/>
+                <w:insideV w:val="single" w:color="auto" w:sz="4"/>
+              </w:tblBorders>
+            </w:tblPr>
+            <w:tblGrid>
+              <w:gridCol w:w="2156"/>
+              <w:gridCol w:w="2154"/>
+            </w:tblGrid>
+            <w:tr>
+              <w:tc>
+                <w:tcPr>
+                  <w:tcW w:type="dxa" w:w="2156"/>
+                  <w:tcBorders>
+                    <w:top w:val="none" w:color="FFFFFF" w:sz="0"/>
+                    <w:left w:val="none" w:color="FFFFFF" w:sz="0"/>
+                    <w:bottom w:val="none" w:color="FFFFFF" w:sz="0"/>
+                    <w:right w:val="none" w:color="FFFFFF" w:sz="0"/>
+                  </w:tcBorders>
+                  <w:tcMar>
+                    <w:top w:type="dxa" w:w="0"/>
+                    <w:left w:type="dxa" w:w="0"/>
+                    <w:bottom w:type="dxa" w:w="0"/>
+                    <w:right w:type="dxa" w:w="0"/>
+                  </w:tcMar>
+                  <w:vAlign w:val="center"/>
+                </w:tcPr>
+                <w:p>
+                  <w:pPr>
+                    <w:spacing w:after="0" w:before="0"/>
+                  </w:pPr>
+                  <w:r>
+                    <w:drawing>
+                      <wp:inline distT="0" distB="0" distL="0" distR="0">
+                        <wp:extent cx="15087600000" cy="10058400000"/>
+                        <wp:effectExtent t="0" r="0" b="0" l="0"/>
+                        <wp:docPr id="1" name="" descr="" title=""/>
+                        <wp:cNvGraphicFramePr>
+                          <a:graphicFrameLocks xmlns:a="http://schemas.openxmlformats.org/drawingml/2006/main" noChangeAspect="1"/>
+                        </wp:cNvGraphicFramePr>
+                        <a:graphic xmlns:a="http://schemas.openxmlformats.org/drawingml/2006/main">
+                          <a:graphicData uri="http://schemas.openxmlformats.org/drawingml/2006/picture">
+                            <pic:pic xmlns:pic="http://schemas.openxmlformats.org/drawingml/2006/picture">
+                              <pic:nvPicPr>
+                                <pic:cNvPr id="0" name="" descr=""/>
+                                <pic:cNvPicPr>
+                                  <a:picLocks noChangeAspect="1" noChangeArrowheads="1"/>
+                                </pic:cNvPicPr>
+                              </pic:nvPicPr>
+                              <pic:blipFill>
+                                <a:blip r:embed="rId7" cstate="none"/>
+                                <a:srcRect/>
+                                <a:stretch>
+                                  <a:fillRect/>
+                                </a:stretch>
+                              </pic:blipFill>
+                              <pic:spPr bwMode="auto">
+                                <a:xfrm>
+                                  <a:off x="0" y="0"/>
+                                  <a:ext cx="15087600000" cy="10058400000"/>
+                                </a:xfrm>
+                                <a:prstGeom prst="rect">
+                                  <a:avLst/>
+                                </a:prstGeom>
+                              </pic:spPr>
+                            </pic:pic>
+                          </a:graphicData>
+                        </a:graphic>
+                      </wp:inline>
+                    </w:drawing>
+                  </w:r>
+                </w:p>
+              </w:tc>
+              <w:tc>
+                <w:tcPr>
+                  <w:tcW w:type="dxa" w:w="2154"/>
+                  <w:tcBorders>
+                    <w:top w:val="none" w:color="FFFFFF" w:sz="0"/>
+                    <w:left w:val="none" w:color="FFFFFF" w:sz="0"/>
+                    <w:bottom w:val="none" w:color="FFFFFF" w:sz="0"/>
+                    <w:right w:val="none" w:color="FFFFFF" w:sz="0"/>
+                  </w:tcBorders>
+                  <w:tcMar>
+                    <w:top w:type="dxa" w:w="0"/>
+                    <w:left w:type="dxa" w:w="113"/>
+                    <w:bottom w:type="dxa" w:w="0"/>
+                    <w:right w:type="dxa" w:w="0"/>
+                  </w:tcMar>
+                  <w:vAlign w:val="center"/>
+                </w:tcPr>
+                <w:p>
+                  <w:pPr>
+                    <w:spacing w:after="45" w:before="0"/>
+                    <w:jc w:val="right"/>
+                  </w:pPr>
+                  <w:r>
+                    <w:rPr>
+                      <w:color w:val="1A6374"/>
+                      <w:sz w:val="11"/>
+                      <w:szCs w:val="11"/>
+                    </w:rPr>
+                    <w:t xml:space="preserve">naturheilpraxis-hilfreich.de</w:t>
+                  </w:r>
+                </w:p>
+                <w:p>
+                  <w:pPr>
+                    <w:spacing w:after="0" w:before="0"/>
+                    <w:jc w:val="right"/>
+                  </w:pPr>
+                  <w:r>
+                    <w:rPr>
+                      <w:color w:val="1A6374"/>
+                      <w:sz w:val="11"/>
+                      <w:szCs w:val="11"/>
+                    </w:rPr>
+                    <w:t xml:space="preserve">info@naturheilpraxis-hilfreich.de</w:t>
+                  </w:r>
+                </w:p>
+              </w:tc>
+            </w:tr>
+          </w:tbl>
+          <w:p>
+            <w:pPr>
+              <w:pBdr>
+                <w:bottom w:val="single" w:color="DDD5C8" w:sz="2" w:space="1"/>
+              </w:pBdr>
+              <w:spacing w:after="0" w:before="85"/>
+            </w:pPr>
+          </w:p>
+          <w:p>
+            <w:pPr>
+              <w:spacing w:after="113" w:before="113"/>
             </w:pPr>
             <w:r>
               <w:rPr>
@@ -928,7 +2009,7 @@
           <w:p>
             <w:pPr>
               <w:pBdr>
-                <w:bottom w:val="single" w:color="B08850" w:sz="3" w:space="3"/>
+                <w:bottom w:val="single" w:color="B08850" w:sz="3" w:space="2"/>
               </w:pBdr>
               <w:spacing w:after="85" w:before="0"/>
             </w:pPr>
@@ -943,19 +2024,126 @@
               <w:t xml:space="preserve">Bei Verhinderung bitten wir um frühzeitige Absage.</w:t>
             </w:r>
           </w:p>
-          <w:p>
-            <w:pPr>
-              <w:spacing w:after="0" w:before="85"/>
-            </w:pPr>
-            <w:r>
-              <w:rPr>
-                <w:color w:val="7E7568"/>
-                <w:sz w:val="13"/>
-                <w:szCs w:val="13"/>
-              </w:rPr>
-              <w:t xml:space="preserve">Homberger Straße 348  ·  0176 22923179</w:t>
-            </w:r>
-          </w:p>
+          <w:tbl>
+            <w:tblPr>
+              <w:tblW w:type="dxa" w:w="4423"/>
+              <w:tblBorders>
+                <w:top w:val="none" w:color="FFFFFF" w:sz="0"/>
+                <w:left w:val="none" w:color="FFFFFF" w:sz="0"/>
+                <w:bottom w:val="none" w:color="FFFFFF" w:sz="0"/>
+                <w:right w:val="none" w:color="FFFFFF" w:sz="0"/>
+                <w:insideH w:val="single" w:color="auto" w:sz="4"/>
+                <w:insideV w:val="single" w:color="auto" w:sz="4"/>
+              </w:tblBorders>
+              <w:tblCellMar>
+                <w:top w:type="dxa" w:w="85"/>
+                <w:left w:type="dxa" w:w="0"/>
+                <w:bottom w:type="dxa" w:w="0"/>
+                <w:right w:type="dxa" w:w="0"/>
+              </w:tblCellMar>
+            </w:tblPr>
+            <w:tblGrid>
+              <w:gridCol w:w="3686"/>
+              <w:gridCol w:w="737"/>
+            </w:tblGrid>
+            <w:tr>
+              <w:tc>
+                <w:tcPr>
+                  <w:tcW w:type="dxa" w:w="3686"/>
+                  <w:tcBorders>
+                    <w:top w:val="none" w:color="FFFFFF" w:sz="0"/>
+                    <w:left w:val="none" w:color="FFFFFF" w:sz="0"/>
+                    <w:bottom w:val="none" w:color="FFFFFF" w:sz="0"/>
+                    <w:right w:val="none" w:color="FFFFFF" w:sz="0"/>
+                  </w:tcBorders>
+                  <w:tcMar>
+                    <w:top w:type="dxa" w:w="0"/>
+                    <w:left w:type="dxa" w:w="0"/>
+                    <w:bottom w:type="dxa" w:w="0"/>
+                    <w:right w:type="dxa" w:w="0"/>
+                  </w:tcMar>
+                  <w:vAlign w:val="center"/>
+                </w:tcPr>
+                <w:p>
+                  <w:pPr>
+                    <w:spacing w:after="0" w:before="0"/>
+                  </w:pPr>
+                  <w:r>
+                    <w:rPr>
+                      <w:color w:val="7E7568"/>
+                      <w:sz w:val="13"/>
+                      <w:szCs w:val="13"/>
+                    </w:rPr>
+                    <w:t xml:space="preserve">Homberger Straße 348  ·  0176 22923179</w:t>
+                  </w:r>
+                </w:p>
+              </w:tc>
+              <w:tc>
+                <w:tcPr>
+                  <w:tcW w:type="dxa" w:w="737"/>
+                  <w:tcBorders>
+                    <w:top w:val="none" w:color="FFFFFF" w:sz="0"/>
+                    <w:left w:val="none" w:color="FFFFFF" w:sz="0"/>
+                    <w:bottom w:val="none" w:color="FFFFFF" w:sz="0"/>
+                    <w:right w:val="none" w:color="FFFFFF" w:sz="0"/>
+                  </w:tcBorders>
+                  <w:tcMar>
+                    <w:top w:type="dxa" w:w="0"/>
+                    <w:left w:type="dxa" w:w="57"/>
+                    <w:bottom w:type="dxa" w:w="0"/>
+                    <w:right w:type="dxa" w:w="0"/>
+                  </w:tcMar>
+                  <w:vAlign w:val="center"/>
+                </w:tcPr>
+                <w:p>
+                  <w:pPr>
+                    <w:spacing w:after="0" w:before="0"/>
+                  </w:pPr>
+                  <w:r>
+                    <w:drawing>
+                      <wp:inline distT="0" distB="0" distL="0" distR="0">
+                        <wp:extent cx="3771900000" cy="3771900000"/>
+                        <wp:effectExtent t="0" r="0" b="0" l="0"/>
+                        <wp:docPr id="1" name="" descr="" title=""/>
+                        <wp:cNvGraphicFramePr>
+                          <a:graphicFrameLocks xmlns:a="http://schemas.openxmlformats.org/drawingml/2006/main" noChangeAspect="1"/>
+                        </wp:cNvGraphicFramePr>
+                        <a:graphic xmlns:a="http://schemas.openxmlformats.org/drawingml/2006/main">
+                          <a:graphicData uri="http://schemas.openxmlformats.org/drawingml/2006/picture">
+                            <pic:pic xmlns:pic="http://schemas.openxmlformats.org/drawingml/2006/picture">
+                              <pic:nvPicPr>
+                                <pic:cNvPr id="0" name="" descr=""/>
+                                <pic:cNvPicPr>
+                                  <a:picLocks noChangeAspect="1" noChangeArrowheads="1"/>
+                                </pic:cNvPicPr>
+                              </pic:nvPicPr>
+                              <pic:blipFill>
+                                <a:blip r:embed="rId8" cstate="none"/>
+                                <a:srcRect/>
+                                <a:stretch>
+                                  <a:fillRect/>
+                                </a:stretch>
+                              </pic:blipFill>
+                              <pic:spPr bwMode="auto">
+                                <a:xfrm>
+                                  <a:off x="0" y="0"/>
+                                  <a:ext cx="3771900000" cy="3771900000"/>
+                                </a:xfrm>
+                                <a:prstGeom prst="rect">
+                                  <a:avLst/>
+                                </a:prstGeom>
+                              </pic:spPr>
+                            </pic:pic>
+                          </a:graphicData>
+                        </a:graphic>
+                      </wp:inline>
+                    </w:drawing>
+                  </w:r>
+                </w:p>
+              </w:tc>
+            </w:tr>
+          </w:tbl>
+          <w:p/>
         </w:tc>
       </w:tr>
       <w:tr>
@@ -979,54 +2167,145 @@
             </w:tcMar>
             <w:vAlign w:val="top"/>
           </w:tcPr>
-          <w:p>
-            <w:pPr>
-              <w:spacing w:after="85" w:before="0"/>
-            </w:pPr>
-            <w:r>
-              <w:drawing>
-                <wp:inline distT="0" distB="0" distL="0" distR="0">
-                  <wp:extent cx="15087600000" cy="10058400000"/>
-                  <wp:effectExtent t="0" r="0" b="0" l="0"/>
-                  <wp:docPr id="1" name="" descr="" title=""/>
-                  <wp:cNvGraphicFramePr>
-                    <a:graphicFrameLocks xmlns:a="http://schemas.openxmlformats.org/drawingml/2006/main" noChangeAspect="1"/>
-                  </wp:cNvGraphicFramePr>
-                  <a:graphic xmlns:a="http://schemas.openxmlformats.org/drawingml/2006/main">
-                    <a:graphicData uri="http://schemas.openxmlformats.org/drawingml/2006/picture">
-                      <pic:pic xmlns:pic="http://schemas.openxmlformats.org/drawingml/2006/picture">
-                        <pic:nvPicPr>
-                          <pic:cNvPr id="0" name="" descr=""/>
-                          <pic:cNvPicPr>
-                            <a:picLocks noChangeAspect="1" noChangeArrowheads="1"/>
-                          </pic:cNvPicPr>
-                        </pic:nvPicPr>
-                        <pic:blipFill>
-                          <a:blip r:embed="rId7" cstate="none"/>
-                          <a:srcRect/>
-                          <a:stretch>
-                            <a:fillRect/>
-                          </a:stretch>
-                        </pic:blipFill>
-                        <pic:spPr bwMode="auto">
-                          <a:xfrm>
-                            <a:off x="0" y="0"/>
-                            <a:ext cx="15087600000" cy="10058400000"/>
-                          </a:xfrm>
-                          <a:prstGeom prst="rect">
-                            <a:avLst/>
-                          </a:prstGeom>
-                        </pic:spPr>
-                      </pic:pic>
-                    </a:graphicData>
-                  </a:graphic>
-                </wp:inline>
-              </w:drawing>
-            </w:r>
-          </w:p>
-          <w:p>
-            <w:pPr>
-              <w:spacing w:after="113" w:before="0"/>
+          <w:tbl>
+            <w:tblPr>
+              <w:tblW w:type="dxa" w:w="4423"/>
+              <w:tblBorders>
+                <w:top w:val="none" w:color="FFFFFF" w:sz="0"/>
+                <w:left w:val="none" w:color="FFFFFF" w:sz="0"/>
+                <w:bottom w:val="none" w:color="FFFFFF" w:sz="0"/>
+                <w:right w:val="none" w:color="FFFFFF" w:sz="0"/>
+                <w:insideH w:val="single" w:color="auto" w:sz="4"/>
+                <w:insideV w:val="single" w:color="auto" w:sz="4"/>
+              </w:tblBorders>
+            </w:tblPr>
+            <w:tblGrid>
+              <w:gridCol w:w="2156"/>
+              <w:gridCol w:w="2154"/>
+            </w:tblGrid>
+            <w:tr>
+              <w:tc>
+                <w:tcPr>
+                  <w:tcW w:type="dxa" w:w="2156"/>
+                  <w:tcBorders>
+                    <w:top w:val="none" w:color="FFFFFF" w:sz="0"/>
+                    <w:left w:val="none" w:color="FFFFFF" w:sz="0"/>
+                    <w:bottom w:val="none" w:color="FFFFFF" w:sz="0"/>
+                    <w:right w:val="none" w:color="FFFFFF" w:sz="0"/>
+                  </w:tcBorders>
+                  <w:tcMar>
+                    <w:top w:type="dxa" w:w="0"/>
+                    <w:left w:type="dxa" w:w="0"/>
+                    <w:bottom w:type="dxa" w:w="0"/>
+                    <w:right w:type="dxa" w:w="0"/>
+                  </w:tcMar>
+                  <w:vAlign w:val="center"/>
+                </w:tcPr>
+                <w:p>
+                  <w:pPr>
+                    <w:spacing w:after="0" w:before="0"/>
+                  </w:pPr>
+                  <w:r>
+                    <w:drawing>
+                      <wp:inline distT="0" distB="0" distL="0" distR="0">
+                        <wp:extent cx="15087600000" cy="10058400000"/>
+                        <wp:effectExtent t="0" r="0" b="0" l="0"/>
+                        <wp:docPr id="1" name="" descr="" title=""/>
+                        <wp:cNvGraphicFramePr>
+                          <a:graphicFrameLocks xmlns:a="http://schemas.openxmlformats.org/drawingml/2006/main" noChangeAspect="1"/>
+                        </wp:cNvGraphicFramePr>
+                        <a:graphic xmlns:a="http://schemas.openxmlformats.org/drawingml/2006/main">
+                          <a:graphicData uri="http://schemas.openxmlformats.org/drawingml/2006/picture">
+                            <pic:pic xmlns:pic="http://schemas.openxmlformats.org/drawingml/2006/picture">
+                              <pic:nvPicPr>
+                                <pic:cNvPr id="0" name="" descr=""/>
+                                <pic:cNvPicPr>
+                                  <a:picLocks noChangeAspect="1" noChangeArrowheads="1"/>
+                                </pic:cNvPicPr>
+                              </pic:nvPicPr>
+                              <pic:blipFill>
+                                <a:blip r:embed="rId7" cstate="none"/>
+                                <a:srcRect/>
+                                <a:stretch>
+                                  <a:fillRect/>
+                                </a:stretch>
+                              </pic:blipFill>
+                              <pic:spPr bwMode="auto">
+                                <a:xfrm>
+                                  <a:off x="0" y="0"/>
+                                  <a:ext cx="15087600000" cy="10058400000"/>
+                                </a:xfrm>
+                                <a:prstGeom prst="rect">
+                                  <a:avLst/>
+                                </a:prstGeom>
+                              </pic:spPr>
+                            </pic:pic>
+                          </a:graphicData>
+                        </a:graphic>
+                      </wp:inline>
+                    </w:drawing>
+                  </w:r>
+                </w:p>
+              </w:tc>
+              <w:tc>
+                <w:tcPr>
+                  <w:tcW w:type="dxa" w:w="2154"/>
+                  <w:tcBorders>
+                    <w:top w:val="none" w:color="FFFFFF" w:sz="0"/>
+                    <w:left w:val="none" w:color="FFFFFF" w:sz="0"/>
+                    <w:bottom w:val="none" w:color="FFFFFF" w:sz="0"/>
+                    <w:right w:val="none" w:color="FFFFFF" w:sz="0"/>
+                  </w:tcBorders>
+                  <w:tcMar>
+                    <w:top w:type="dxa" w:w="0"/>
+                    <w:left w:type="dxa" w:w="113"/>
+                    <w:bottom w:type="dxa" w:w="0"/>
+                    <w:right w:type="dxa" w:w="0"/>
+                  </w:tcMar>
+                  <w:vAlign w:val="center"/>
+                </w:tcPr>
+                <w:p>
+                  <w:pPr>
+                    <w:spacing w:after="45" w:before="0"/>
+                    <w:jc w:val="right"/>
+                  </w:pPr>
+                  <w:r>
+                    <w:rPr>
+                      <w:color w:val="1A6374"/>
+                      <w:sz w:val="11"/>
+                      <w:szCs w:val="11"/>
+                    </w:rPr>
+                    <w:t xml:space="preserve">naturheilpraxis-hilfreich.de</w:t>
+                  </w:r>
+                </w:p>
+                <w:p>
+                  <w:pPr>
+                    <w:spacing w:after="0" w:before="0"/>
+                    <w:jc w:val="right"/>
+                  </w:pPr>
+                  <w:r>
+                    <w:rPr>
+                      <w:color w:val="1A6374"/>
+                      <w:sz w:val="11"/>
+                      <w:szCs w:val="11"/>
+                    </w:rPr>
+                    <w:t xml:space="preserve">info@naturheilpraxis-hilfreich.de</w:t>
+                  </w:r>
+                </w:p>
+              </w:tc>
+            </w:tr>
+          </w:tbl>
+          <w:p>
+            <w:pPr>
+              <w:pBdr>
+                <w:bottom w:val="single" w:color="DDD5C8" w:sz="2" w:space="1"/>
+              </w:pBdr>
+              <w:spacing w:after="0" w:before="85"/>
+            </w:pPr>
+          </w:p>
+          <w:p>
+            <w:pPr>
+              <w:spacing w:after="113" w:before="113"/>
             </w:pPr>
             <w:r>
               <w:rPr>
@@ -1081,7 +2360,7 @@
           <w:p>
             <w:pPr>
               <w:pBdr>
-                <w:bottom w:val="single" w:color="B08850" w:sz="3" w:space="3"/>
+                <w:bottom w:val="single" w:color="B08850" w:sz="3" w:space="2"/>
               </w:pBdr>
               <w:spacing w:after="85" w:before="0"/>
             </w:pPr>
@@ -1096,19 +2375,126 @@
               <w:t xml:space="preserve">Bei Verhinderung bitten wir um frühzeitige Absage.</w:t>
             </w:r>
           </w:p>
-          <w:p>
-            <w:pPr>
-              <w:spacing w:after="0" w:before="85"/>
-            </w:pPr>
-            <w:r>
-              <w:rPr>
-                <w:color w:val="7E7568"/>
-                <w:sz w:val="13"/>
-                <w:szCs w:val="13"/>
-              </w:rPr>
-              <w:t xml:space="preserve">Homberger Straße 348  ·  0176 22923179</w:t>
-            </w:r>
-          </w:p>
+          <w:tbl>
+            <w:tblPr>
+              <w:tblW w:type="dxa" w:w="4423"/>
+              <w:tblBorders>
+                <w:top w:val="none" w:color="FFFFFF" w:sz="0"/>
+                <w:left w:val="none" w:color="FFFFFF" w:sz="0"/>
+                <w:bottom w:val="none" w:color="FFFFFF" w:sz="0"/>
+                <w:right w:val="none" w:color="FFFFFF" w:sz="0"/>
+                <w:insideH w:val="single" w:color="auto" w:sz="4"/>
+                <w:insideV w:val="single" w:color="auto" w:sz="4"/>
+              </w:tblBorders>
+              <w:tblCellMar>
+                <w:top w:type="dxa" w:w="85"/>
+                <w:left w:type="dxa" w:w="0"/>
+                <w:bottom w:type="dxa" w:w="0"/>
+                <w:right w:type="dxa" w:w="0"/>
+              </w:tblCellMar>
+            </w:tblPr>
+            <w:tblGrid>
+              <w:gridCol w:w="3686"/>
+              <w:gridCol w:w="737"/>
+            </w:tblGrid>
+            <w:tr>
+              <w:tc>
+                <w:tcPr>
+                  <w:tcW w:type="dxa" w:w="3686"/>
+                  <w:tcBorders>
+                    <w:top w:val="none" w:color="FFFFFF" w:sz="0"/>
+                    <w:left w:val="none" w:color="FFFFFF" w:sz="0"/>
+                    <w:bottom w:val="none" w:color="FFFFFF" w:sz="0"/>
+                    <w:right w:val="none" w:color="FFFFFF" w:sz="0"/>
+                  </w:tcBorders>
+                  <w:tcMar>
+                    <w:top w:type="dxa" w:w="0"/>
+                    <w:left w:type="dxa" w:w="0"/>
+                    <w:bottom w:type="dxa" w:w="0"/>
+                    <w:right w:type="dxa" w:w="0"/>
+                  </w:tcMar>
+                  <w:vAlign w:val="center"/>
+                </w:tcPr>
+                <w:p>
+                  <w:pPr>
+                    <w:spacing w:after="0" w:before="0"/>
+                  </w:pPr>
+                  <w:r>
+                    <w:rPr>
+                      <w:color w:val="7E7568"/>
+                      <w:sz w:val="13"/>
+                      <w:szCs w:val="13"/>
+                    </w:rPr>
+                    <w:t xml:space="preserve">Homberger Straße 348  ·  0176 22923179</w:t>
+                  </w:r>
+                </w:p>
+              </w:tc>
+              <w:tc>
+                <w:tcPr>
+                  <w:tcW w:type="dxa" w:w="737"/>
+                  <w:tcBorders>
+                    <w:top w:val="none" w:color="FFFFFF" w:sz="0"/>
+                    <w:left w:val="none" w:color="FFFFFF" w:sz="0"/>
+                    <w:bottom w:val="none" w:color="FFFFFF" w:sz="0"/>
+                    <w:right w:val="none" w:color="FFFFFF" w:sz="0"/>
+                  </w:tcBorders>
+                  <w:tcMar>
+                    <w:top w:type="dxa" w:w="0"/>
+                    <w:left w:type="dxa" w:w="57"/>
+                    <w:bottom w:type="dxa" w:w="0"/>
+                    <w:right w:type="dxa" w:w="0"/>
+                  </w:tcMar>
+                  <w:vAlign w:val="center"/>
+                </w:tcPr>
+                <w:p>
+                  <w:pPr>
+                    <w:spacing w:after="0" w:before="0"/>
+                  </w:pPr>
+                  <w:r>
+                    <w:drawing>
+                      <wp:inline distT="0" distB="0" distL="0" distR="0">
+                        <wp:extent cx="3771900000" cy="3771900000"/>
+                        <wp:effectExtent t="0" r="0" b="0" l="0"/>
+                        <wp:docPr id="1" name="" descr="" title=""/>
+                        <wp:cNvGraphicFramePr>
+                          <a:graphicFrameLocks xmlns:a="http://schemas.openxmlformats.org/drawingml/2006/main" noChangeAspect="1"/>
+                        </wp:cNvGraphicFramePr>
+                        <a:graphic xmlns:a="http://schemas.openxmlformats.org/drawingml/2006/main">
+                          <a:graphicData uri="http://schemas.openxmlformats.org/drawingml/2006/picture">
+                            <pic:pic xmlns:pic="http://schemas.openxmlformats.org/drawingml/2006/picture">
+                              <pic:nvPicPr>
+                                <pic:cNvPr id="0" name="" descr=""/>
+                                <pic:cNvPicPr>
+                                  <a:picLocks noChangeAspect="1" noChangeArrowheads="1"/>
+                                </pic:cNvPicPr>
+                              </pic:nvPicPr>
+                              <pic:blipFill>
+                                <a:blip r:embed="rId8" cstate="none"/>
+                                <a:srcRect/>
+                                <a:stretch>
+                                  <a:fillRect/>
+                                </a:stretch>
+                              </pic:blipFill>
+                              <pic:spPr bwMode="auto">
+                                <a:xfrm>
+                                  <a:off x="0" y="0"/>
+                                  <a:ext cx="3771900000" cy="3771900000"/>
+                                </a:xfrm>
+                                <a:prstGeom prst="rect">
+                                  <a:avLst/>
+                                </a:prstGeom>
+                              </pic:spPr>
+                            </pic:pic>
+                          </a:graphicData>
+                        </a:graphic>
+                      </wp:inline>
+                    </w:drawing>
+                  </w:r>
+                </w:p>
+              </w:tc>
+            </w:tr>
+          </w:tbl>
+          <w:p/>
         </w:tc>
         <w:tc>
           <w:tcPr>
@@ -1139,54 +2525,145 @@
             </w:tcMar>
             <w:vAlign w:val="top"/>
           </w:tcPr>
-          <w:p>
-            <w:pPr>
-              <w:spacing w:after="85" w:before="0"/>
-            </w:pPr>
-            <w:r>
-              <w:drawing>
-                <wp:inline distT="0" distB="0" distL="0" distR="0">
-                  <wp:extent cx="15087600000" cy="10058400000"/>
-                  <wp:effectExtent t="0" r="0" b="0" l="0"/>
-                  <wp:docPr id="1" name="" descr="" title=""/>
-                  <wp:cNvGraphicFramePr>
-                    <a:graphicFrameLocks xmlns:a="http://schemas.openxmlformats.org/drawingml/2006/main" noChangeAspect="1"/>
-                  </wp:cNvGraphicFramePr>
-                  <a:graphic xmlns:a="http://schemas.openxmlformats.org/drawingml/2006/main">
-                    <a:graphicData uri="http://schemas.openxmlformats.org/drawingml/2006/picture">
-                      <pic:pic xmlns:pic="http://schemas.openxmlformats.org/drawingml/2006/picture">
-                        <pic:nvPicPr>
-                          <pic:cNvPr id="0" name="" descr=""/>
-                          <pic:cNvPicPr>
-                            <a:picLocks noChangeAspect="1" noChangeArrowheads="1"/>
-                          </pic:cNvPicPr>
-                        </pic:nvPicPr>
-                        <pic:blipFill>
-                          <a:blip r:embed="rId7" cstate="none"/>
-                          <a:srcRect/>
-                          <a:stretch>
-                            <a:fillRect/>
-                          </a:stretch>
-                        </pic:blipFill>
-                        <pic:spPr bwMode="auto">
-                          <a:xfrm>
-                            <a:off x="0" y="0"/>
-                            <a:ext cx="15087600000" cy="10058400000"/>
-                          </a:xfrm>
-                          <a:prstGeom prst="rect">
-                            <a:avLst/>
-                          </a:prstGeom>
-                        </pic:spPr>
-                      </pic:pic>
-                    </a:graphicData>
-                  </a:graphic>
-                </wp:inline>
-              </w:drawing>
-            </w:r>
-          </w:p>
-          <w:p>
-            <w:pPr>
-              <w:spacing w:after="113" w:before="0"/>
+          <w:tbl>
+            <w:tblPr>
+              <w:tblW w:type="dxa" w:w="4423"/>
+              <w:tblBorders>
+                <w:top w:val="none" w:color="FFFFFF" w:sz="0"/>
+                <w:left w:val="none" w:color="FFFFFF" w:sz="0"/>
+                <w:bottom w:val="none" w:color="FFFFFF" w:sz="0"/>
+                <w:right w:val="none" w:color="FFFFFF" w:sz="0"/>
+                <w:insideH w:val="single" w:color="auto" w:sz="4"/>
+                <w:insideV w:val="single" w:color="auto" w:sz="4"/>
+              </w:tblBorders>
+            </w:tblPr>
+            <w:tblGrid>
+              <w:gridCol w:w="2156"/>
+              <w:gridCol w:w="2154"/>
+            </w:tblGrid>
+            <w:tr>
+              <w:tc>
+                <w:tcPr>
+                  <w:tcW w:type="dxa" w:w="2156"/>
+                  <w:tcBorders>
+                    <w:top w:val="none" w:color="FFFFFF" w:sz="0"/>
+                    <w:left w:val="none" w:color="FFFFFF" w:sz="0"/>
+                    <w:bottom w:val="none" w:color="FFFFFF" w:sz="0"/>
+                    <w:right w:val="none" w:color="FFFFFF" w:sz="0"/>
+                  </w:tcBorders>
+                  <w:tcMar>
+                    <w:top w:type="dxa" w:w="0"/>
+                    <w:left w:type="dxa" w:w="0"/>
+                    <w:bottom w:type="dxa" w:w="0"/>
+                    <w:right w:type="dxa" w:w="0"/>
+                  </w:tcMar>
+                  <w:vAlign w:val="center"/>
+                </w:tcPr>
+                <w:p>
+                  <w:pPr>
+                    <w:spacing w:after="0" w:before="0"/>
+                  </w:pPr>
+                  <w:r>
+                    <w:drawing>
+                      <wp:inline distT="0" distB="0" distL="0" distR="0">
+                        <wp:extent cx="15087600000" cy="10058400000"/>
+                        <wp:effectExtent t="0" r="0" b="0" l="0"/>
+                        <wp:docPr id="1" name="" descr="" title=""/>
+                        <wp:cNvGraphicFramePr>
+                          <a:graphicFrameLocks xmlns:a="http://schemas.openxmlformats.org/drawingml/2006/main" noChangeAspect="1"/>
+                        </wp:cNvGraphicFramePr>
+                        <a:graphic xmlns:a="http://schemas.openxmlformats.org/drawingml/2006/main">
+                          <a:graphicData uri="http://schemas.openxmlformats.org/drawingml/2006/picture">
+                            <pic:pic xmlns:pic="http://schemas.openxmlformats.org/drawingml/2006/picture">
+                              <pic:nvPicPr>
+                                <pic:cNvPr id="0" name="" descr=""/>
+                                <pic:cNvPicPr>
+                                  <a:picLocks noChangeAspect="1" noChangeArrowheads="1"/>
+                                </pic:cNvPicPr>
+                              </pic:nvPicPr>
+                              <pic:blipFill>
+                                <a:blip r:embed="rId7" cstate="none"/>
+                                <a:srcRect/>
+                                <a:stretch>
+                                  <a:fillRect/>
+                                </a:stretch>
+                              </pic:blipFill>
+                              <pic:spPr bwMode="auto">
+                                <a:xfrm>
+                                  <a:off x="0" y="0"/>
+                                  <a:ext cx="15087600000" cy="10058400000"/>
+                                </a:xfrm>
+                                <a:prstGeom prst="rect">
+                                  <a:avLst/>
+                                </a:prstGeom>
+                              </pic:spPr>
+                            </pic:pic>
+                          </a:graphicData>
+                        </a:graphic>
+                      </wp:inline>
+                    </w:drawing>
+                  </w:r>
+                </w:p>
+              </w:tc>
+              <w:tc>
+                <w:tcPr>
+                  <w:tcW w:type="dxa" w:w="2154"/>
+                  <w:tcBorders>
+                    <w:top w:val="none" w:color="FFFFFF" w:sz="0"/>
+                    <w:left w:val="none" w:color="FFFFFF" w:sz="0"/>
+                    <w:bottom w:val="none" w:color="FFFFFF" w:sz="0"/>
+                    <w:right w:val="none" w:color="FFFFFF" w:sz="0"/>
+                  </w:tcBorders>
+                  <w:tcMar>
+                    <w:top w:type="dxa" w:w="0"/>
+                    <w:left w:type="dxa" w:w="113"/>
+                    <w:bottom w:type="dxa" w:w="0"/>
+                    <w:right w:type="dxa" w:w="0"/>
+                  </w:tcMar>
+                  <w:vAlign w:val="center"/>
+                </w:tcPr>
+                <w:p>
+                  <w:pPr>
+                    <w:spacing w:after="45" w:before="0"/>
+                    <w:jc w:val="right"/>
+                  </w:pPr>
+                  <w:r>
+                    <w:rPr>
+                      <w:color w:val="1A6374"/>
+                      <w:sz w:val="11"/>
+                      <w:szCs w:val="11"/>
+                    </w:rPr>
+                    <w:t xml:space="preserve">naturheilpraxis-hilfreich.de</w:t>
+                  </w:r>
+                </w:p>
+                <w:p>
+                  <w:pPr>
+                    <w:spacing w:after="0" w:before="0"/>
+                    <w:jc w:val="right"/>
+                  </w:pPr>
+                  <w:r>
+                    <w:rPr>
+                      <w:color w:val="1A6374"/>
+                      <w:sz w:val="11"/>
+                      <w:szCs w:val="11"/>
+                    </w:rPr>
+                    <w:t xml:space="preserve">info@naturheilpraxis-hilfreich.de</w:t>
+                  </w:r>
+                </w:p>
+              </w:tc>
+            </w:tr>
+          </w:tbl>
+          <w:p>
+            <w:pPr>
+              <w:pBdr>
+                <w:bottom w:val="single" w:color="DDD5C8" w:sz="2" w:space="1"/>
+              </w:pBdr>
+              <w:spacing w:after="0" w:before="85"/>
+            </w:pPr>
+          </w:p>
+          <w:p>
+            <w:pPr>
+              <w:spacing w:after="113" w:before="113"/>
             </w:pPr>
             <w:r>
               <w:rPr>
@@ -1241,7 +2718,7 @@
           <w:p>
             <w:pPr>
               <w:pBdr>
-                <w:bottom w:val="single" w:color="B08850" w:sz="3" w:space="3"/>
+                <w:bottom w:val="single" w:color="B08850" w:sz="3" w:space="2"/>
               </w:pBdr>
               <w:spacing w:after="85" w:before="0"/>
             </w:pPr>
@@ -1256,19 +2733,126 @@
               <w:t xml:space="preserve">Bei Verhinderung bitten wir um frühzeitige Absage.</w:t>
             </w:r>
           </w:p>
-          <w:p>
-            <w:pPr>
-              <w:spacing w:after="0" w:before="85"/>
-            </w:pPr>
-            <w:r>
-              <w:rPr>
-                <w:color w:val="7E7568"/>
-                <w:sz w:val="13"/>
-                <w:szCs w:val="13"/>
-              </w:rPr>
-              <w:t xml:space="preserve">Homberger Straße 348  ·  0176 22923179</w:t>
-            </w:r>
-          </w:p>
+          <w:tbl>
+            <w:tblPr>
+              <w:tblW w:type="dxa" w:w="4423"/>
+              <w:tblBorders>
+                <w:top w:val="none" w:color="FFFFFF" w:sz="0"/>
+                <w:left w:val="none" w:color="FFFFFF" w:sz="0"/>
+                <w:bottom w:val="none" w:color="FFFFFF" w:sz="0"/>
+                <w:right w:val="none" w:color="FFFFFF" w:sz="0"/>
+                <w:insideH w:val="single" w:color="auto" w:sz="4"/>
+                <w:insideV w:val="single" w:color="auto" w:sz="4"/>
+              </w:tblBorders>
+              <w:tblCellMar>
+                <w:top w:type="dxa" w:w="85"/>
+                <w:left w:type="dxa" w:w="0"/>
+                <w:bottom w:type="dxa" w:w="0"/>
+                <w:right w:type="dxa" w:w="0"/>
+              </w:tblCellMar>
+            </w:tblPr>
+            <w:tblGrid>
+              <w:gridCol w:w="3686"/>
+              <w:gridCol w:w="737"/>
+            </w:tblGrid>
+            <w:tr>
+              <w:tc>
+                <w:tcPr>
+                  <w:tcW w:type="dxa" w:w="3686"/>
+                  <w:tcBorders>
+                    <w:top w:val="none" w:color="FFFFFF" w:sz="0"/>
+                    <w:left w:val="none" w:color="FFFFFF" w:sz="0"/>
+                    <w:bottom w:val="none" w:color="FFFFFF" w:sz="0"/>
+                    <w:right w:val="none" w:color="FFFFFF" w:sz="0"/>
+                  </w:tcBorders>
+                  <w:tcMar>
+                    <w:top w:type="dxa" w:w="0"/>
+                    <w:left w:type="dxa" w:w="0"/>
+                    <w:bottom w:type="dxa" w:w="0"/>
+                    <w:right w:type="dxa" w:w="0"/>
+                  </w:tcMar>
+                  <w:vAlign w:val="center"/>
+                </w:tcPr>
+                <w:p>
+                  <w:pPr>
+                    <w:spacing w:after="0" w:before="0"/>
+                  </w:pPr>
+                  <w:r>
+                    <w:rPr>
+                      <w:color w:val="7E7568"/>
+                      <w:sz w:val="13"/>
+                      <w:szCs w:val="13"/>
+                    </w:rPr>
+                    <w:t xml:space="preserve">Homberger Straße 348  ·  0176 22923179</w:t>
+                  </w:r>
+                </w:p>
+              </w:tc>
+              <w:tc>
+                <w:tcPr>
+                  <w:tcW w:type="dxa" w:w="737"/>
+                  <w:tcBorders>
+                    <w:top w:val="none" w:color="FFFFFF" w:sz="0"/>
+                    <w:left w:val="none" w:color="FFFFFF" w:sz="0"/>
+                    <w:bottom w:val="none" w:color="FFFFFF" w:sz="0"/>
+                    <w:right w:val="none" w:color="FFFFFF" w:sz="0"/>
+                  </w:tcBorders>
+                  <w:tcMar>
+                    <w:top w:type="dxa" w:w="0"/>
+                    <w:left w:type="dxa" w:w="57"/>
+                    <w:bottom w:type="dxa" w:w="0"/>
+                    <w:right w:type="dxa" w:w="0"/>
+                  </w:tcMar>
+                  <w:vAlign w:val="center"/>
+                </w:tcPr>
+                <w:p>
+                  <w:pPr>
+                    <w:spacing w:after="0" w:before="0"/>
+                  </w:pPr>
+                  <w:r>
+                    <w:drawing>
+                      <wp:inline distT="0" distB="0" distL="0" distR="0">
+                        <wp:extent cx="3771900000" cy="3771900000"/>
+                        <wp:effectExtent t="0" r="0" b="0" l="0"/>
+                        <wp:docPr id="1" name="" descr="" title=""/>
+                        <wp:cNvGraphicFramePr>
+                          <a:graphicFrameLocks xmlns:a="http://schemas.openxmlformats.org/drawingml/2006/main" noChangeAspect="1"/>
+                        </wp:cNvGraphicFramePr>
+                        <a:graphic xmlns:a="http://schemas.openxmlformats.org/drawingml/2006/main">
+                          <a:graphicData uri="http://schemas.openxmlformats.org/drawingml/2006/picture">
+                            <pic:pic xmlns:pic="http://schemas.openxmlformats.org/drawingml/2006/picture">
+                              <pic:nvPicPr>
+                                <pic:cNvPr id="0" name="" descr=""/>
+                                <pic:cNvPicPr>
+                                  <a:picLocks noChangeAspect="1" noChangeArrowheads="1"/>
+                                </pic:cNvPicPr>
+                              </pic:nvPicPr>
+                              <pic:blipFill>
+                                <a:blip r:embed="rId8" cstate="none"/>
+                                <a:srcRect/>
+                                <a:stretch>
+                                  <a:fillRect/>
+                                </a:stretch>
+                              </pic:blipFill>
+                              <pic:spPr bwMode="auto">
+                                <a:xfrm>
+                                  <a:off x="0" y="0"/>
+                                  <a:ext cx="3771900000" cy="3771900000"/>
+                                </a:xfrm>
+                                <a:prstGeom prst="rect">
+                                  <a:avLst/>
+                                </a:prstGeom>
+                              </pic:spPr>
+                            </pic:pic>
+                          </a:graphicData>
+                        </a:graphic>
+                      </wp:inline>
+                    </w:drawing>
+                  </w:r>
+                </w:p>
+              </w:tc>
+            </w:tr>
+          </w:tbl>
+          <w:p/>
         </w:tc>
       </w:tr>
     </w:tbl>

</xml_diff>

<commit_message>
Restore original cancellation text, fix umlaut as HTML entity, restore gold gradient rule
</commit_message>
<xml_diff>
--- a/Terminkarten.docx
+++ b/Terminkarten.docx
@@ -154,7 +154,7 @@
                 <w:sz w:val="11"/>
                 <w:szCs w:val="11"/>
               </w:rPr>
-              <w:t xml:space="preserve">Bitte rechtzeitig absagen bei Verhinderung.</w:t>
+              <w:t xml:space="preserve">Bei Verhinderung bitten wir um frühzeitige Absage.</w:t>
             </w:r>
           </w:p>
           <w:p>
@@ -314,7 +314,7 @@
                 <w:sz w:val="11"/>
                 <w:szCs w:val="11"/>
               </w:rPr>
-              <w:t xml:space="preserve">Bitte rechtzeitig absagen bei Verhinderung.</w:t>
+              <w:t xml:space="preserve">Bei Verhinderung bitten wir um frühzeitige Absage.</w:t>
             </w:r>
           </w:p>
           <w:p>
@@ -467,7 +467,7 @@
                 <w:sz w:val="11"/>
                 <w:szCs w:val="11"/>
               </w:rPr>
-              <w:t xml:space="preserve">Bitte rechtzeitig absagen bei Verhinderung.</w:t>
+              <w:t xml:space="preserve">Bei Verhinderung bitten wir um frühzeitige Absage.</w:t>
             </w:r>
           </w:p>
           <w:p>
@@ -627,7 +627,7 @@
                 <w:sz w:val="11"/>
                 <w:szCs w:val="11"/>
               </w:rPr>
-              <w:t xml:space="preserve">Bitte rechtzeitig absagen bei Verhinderung.</w:t>
+              <w:t xml:space="preserve">Bei Verhinderung bitten wir um frühzeitige Absage.</w:t>
             </w:r>
           </w:p>
           <w:p>
@@ -780,7 +780,7 @@
                 <w:sz w:val="11"/>
                 <w:szCs w:val="11"/>
               </w:rPr>
-              <w:t xml:space="preserve">Bitte rechtzeitig absagen bei Verhinderung.</w:t>
+              <w:t xml:space="preserve">Bei Verhinderung bitten wir um frühzeitige Absage.</w:t>
             </w:r>
           </w:p>
           <w:p>
@@ -940,7 +940,7 @@
                 <w:sz w:val="11"/>
                 <w:szCs w:val="11"/>
               </w:rPr>
-              <w:t xml:space="preserve">Bitte rechtzeitig absagen bei Verhinderung.</w:t>
+              <w:t xml:space="preserve">Bei Verhinderung bitten wir um frühzeitige Absage.</w:t>
             </w:r>
           </w:p>
           <w:p>
@@ -1093,7 +1093,7 @@
                 <w:sz w:val="11"/>
                 <w:szCs w:val="11"/>
               </w:rPr>
-              <w:t xml:space="preserve">Bitte rechtzeitig absagen bei Verhinderung.</w:t>
+              <w:t xml:space="preserve">Bei Verhinderung bitten wir um frühzeitige Absage.</w:t>
             </w:r>
           </w:p>
           <w:p>
@@ -1253,7 +1253,7 @@
                 <w:sz w:val="11"/>
                 <w:szCs w:val="11"/>
               </w:rPr>
-              <w:t xml:space="preserve">Bitte rechtzeitig absagen bei Verhinderung.</w:t>
+              <w:t xml:space="preserve">Bei Verhinderung bitten wir um frühzeitige Absage.</w:t>
             </w:r>
           </w:p>
           <w:p>

</xml_diff>